<commit_message>
Đóng phiên: tag Word, 3 thẻ theo cấp ĐA, trang soạn và xuất Word/PDF.
Gắn {tag} vào mẫu; Lập mở trang riêng với Lưu / Xuất Word (docxtemplater) / PDF in trình duyệt.

Co-authored-by: Cursor <cursoragent@cursor.com>
</commit_message>
<xml_diff>
--- a/public/templates/qd-giao-nhiem-vu-tnhc.docx
+++ b/public/templates/qd-giao-nhiem-vu-tnhc.docx
@@ -1,5 +1,99 @@
 
-<file path=word/document.xml><?xml version="1.0" encoding="utf-8"?>
+<file path=customXml\item1.xml><?xml version="1.0" encoding="utf-8"?>
+<b:Sources xmlns:b="http://schemas.openxmlformats.org/officeDocument/2006/bibliography" xmlns="http://schemas.openxmlformats.org/officeDocument/2006/bibliography" SelectedStyle="/APA.XSL" StyleName="APA"/>
+</file>
+
+<file path=customXml\itemProps1.xml><?xml version="1.0" encoding="utf-8"?>
+<ds:datastoreItem xmlns:ds="http://schemas.openxmlformats.org/officeDocument/2006/customXml" ds:itemID="{EF278816-EC6F-A645-907D-7F25AECB1D4A}">
+  <ds:schemaRefs>
+    <ds:schemaRef ds:uri="http://schemas.openxmlformats.org/officeDocument/2006/bibliography"/>
+  </ds:schemaRefs>
+</ds:datastoreItem>
+</file>
+
+<file path=docProps\app.xml><?xml version="1.0" encoding="utf-8"?>
+<Properties xmlns="http://schemas.openxmlformats.org/officeDocument/2006/extended-properties" xmlns:vt="http://schemas.openxmlformats.org/officeDocument/2006/docPropsVTypes">
+  <Template>Normal.dotm</Template>
+  <TotalTime>15</TotalTime>
+  <Pages>3</Pages>
+  <Words>572</Words>
+  <Characters>3266</Characters>
+  <Application>Microsoft Office Word</Application>
+  <DocSecurity>0</DocSecurity>
+  <Lines>27</Lines>
+  <Paragraphs>7</Paragraphs>
+  <ScaleCrop>false</ScaleCrop>
+  <HeadingPairs>
+    <vt:vector size="2" baseType="variant">
+      <vt:variant>
+        <vt:lpstr>Title</vt:lpstr>
+      </vt:variant>
+      <vt:variant>
+        <vt:i4>1</vt:i4>
+      </vt:variant>
+    </vt:vector>
+  </HeadingPairs>
+  <TitlesOfParts>
+    <vt:vector size="1" baseType="lpstr">
+      <vt:lpstr/>
+    </vt:vector>
+  </TitlesOfParts>
+  <Manager/>
+  <Company/>
+  <LinksUpToDate>false</LinksUpToDate>
+  <CharactersWithSpaces>3831</CharactersWithSpaces>
+  <SharedDoc>false</SharedDoc>
+  <HyperlinkBase/>
+  <HyperlinksChanged>false</HyperlinksChanged>
+  <AppVersion>16.0000</AppVersion>
+</Properties>
+</file>
+
+<file path=docProps\core.xml><?xml version="1.0" encoding="utf-8"?>
+<cp:coreProperties xmlns:cp="http://schemas.openxmlformats.org/package/2006/metadata/core-properties" xmlns:dc="http://purl.org/dc/elements/1.1/" xmlns:dcterms="http://purl.org/dc/terms/" xmlns:dcmitype="http://purl.org/dc/dcmitype/" xmlns:xsi="http://www.w3.org/2001/XMLSchema-instance">
+  <dc:title/>
+  <dc:subject/>
+  <dc:creator>python-docx</dc:creator>
+  <cp:keywords/>
+  <dc:description>generated by python-docx</dc:description>
+  <cp:lastModifiedBy>Phương Đỗ Minh</cp:lastModifiedBy>
+  <cp:revision>3</cp:revision>
+  <dcterms:created xsi:type="dcterms:W3CDTF">2013-12-23T23:15:00Z</dcterms:created>
+  <dcterms:modified xsi:type="dcterms:W3CDTF">2026-07-23T10:55:00Z</dcterms:modified>
+  <cp:category/>
+</cp:coreProperties>
+</file>
+
+<file path=docProps\custom.xml><?xml version="1.0" encoding="utf-8"?>
+<Properties xmlns="http://schemas.openxmlformats.org/officeDocument/2006/custom-properties" xmlns:vt="http://schemas.openxmlformats.org/officeDocument/2006/docPropsVTypes">
+  <property fmtid="{D5CDD505-2E9C-101B-9397-08002B2CF9AE}" pid="2" name="MSIP_Label_defa4170-0d19-0005-0004-bc88714345d2_Enabled">
+    <vt:lpwstr>true</vt:lpwstr>
+  </property>
+  <property fmtid="{D5CDD505-2E9C-101B-9397-08002B2CF9AE}" pid="3" name="MSIP_Label_defa4170-0d19-0005-0004-bc88714345d2_SetDate">
+    <vt:lpwstr>2026-07-23T10:39:17Z</vt:lpwstr>
+  </property>
+  <property fmtid="{D5CDD505-2E9C-101B-9397-08002B2CF9AE}" pid="4" name="MSIP_Label_defa4170-0d19-0005-0004-bc88714345d2_Method">
+    <vt:lpwstr>Standard</vt:lpwstr>
+  </property>
+  <property fmtid="{D5CDD505-2E9C-101B-9397-08002B2CF9AE}" pid="5" name="MSIP_Label_defa4170-0d19-0005-0004-bc88714345d2_Name">
+    <vt:lpwstr>defa4170-0d19-0005-0004-bc88714345d2</vt:lpwstr>
+  </property>
+  <property fmtid="{D5CDD505-2E9C-101B-9397-08002B2CF9AE}" pid="6" name="MSIP_Label_defa4170-0d19-0005-0004-bc88714345d2_SiteId">
+    <vt:lpwstr>6e8d75a1-703a-4f22-b366-775bd30bead6</vt:lpwstr>
+  </property>
+  <property fmtid="{D5CDD505-2E9C-101B-9397-08002B2CF9AE}" pid="7" name="MSIP_Label_defa4170-0d19-0005-0004-bc88714345d2_ActionId">
+    <vt:lpwstr>d43790e6-a607-41c0-bd2c-5f35b5be3390</vt:lpwstr>
+  </property>
+  <property fmtid="{D5CDD505-2E9C-101B-9397-08002B2CF9AE}" pid="8" name="MSIP_Label_defa4170-0d19-0005-0004-bc88714345d2_ContentBits">
+    <vt:lpwstr>0</vt:lpwstr>
+  </property>
+  <property fmtid="{D5CDD505-2E9C-101B-9397-08002B2CF9AE}" pid="9" name="MSIP_Label_defa4170-0d19-0005-0004-bc88714345d2_Tag">
+    <vt:lpwstr>10, 3, 0, 1</vt:lpwstr>
+  </property>
+</Properties>
+</file>
+
+<file path=word\document.xml><?xml version="1.0" encoding="utf-8"?>
 <w:document xmlns:wpc="http://schemas.microsoft.com/office/word/2010/wordprocessingCanvas" xmlns:cx="http://schemas.microsoft.com/office/drawing/2014/chartex" xmlns:cx1="http://schemas.microsoft.com/office/drawing/2015/9/8/chartex" xmlns:cx2="http://schemas.microsoft.com/office/drawing/2015/10/21/chartex" xmlns:cx3="http://schemas.microsoft.com/office/drawing/2016/5/9/chartex" xmlns:cx4="http://schemas.microsoft.com/office/drawing/2016/5/10/chartex" xmlns:cx5="http://schemas.microsoft.com/office/drawing/2016/5/11/chartex" xmlns:cx6="http://schemas.microsoft.com/office/drawing/2016/5/12/chartex" xmlns:cx7="http://schemas.microsoft.com/office/drawing/2016/5/13/chartex" xmlns:cx8="http://schemas.microsoft.com/office/drawing/2016/5/14/chartex" xmlns:mc="http://schemas.openxmlformats.org/markup-compatibility/2006" xmlns:aink="http://schemas.microsoft.com/office/drawing/2016/ink" xmlns:am3d="http://schemas.microsoft.com/office/drawing/2017/model3d" xmlns:o="urn:schemas-microsoft-com:office:office" xmlns:oel="http://schemas.microsoft.com/office/2019/extlst" xmlns:r="http://schemas.openxmlformats.org/officeDocument/2006/relationships" xmlns:m="http://schemas.openxmlformats.org/officeDocument/2006/math" xmlns:v="urn:schemas-microsoft-com:vml" xmlns:wp14="http://schemas.microsoft.com/office/word/2010/wordprocessingDrawing" xmlns:wp="http://schemas.openxmlformats.org/drawingml/2006/wordprocessingDrawing" xmlns:w10="urn:schemas-microsoft-com:office:word" xmlns:w="http://schemas.openxmlformats.org/wordprocessingml/2006/main" xmlns:w14="http://schemas.microsoft.com/office/word/2010/wordml" xmlns:w15="http://schemas.microsoft.com/office/word/2012/wordml" xmlns:w16cex="http://schemas.microsoft.com/office/word/2018/wordml/cex" xmlns:w16cid="http://schemas.microsoft.com/office/word/2016/wordml/cid" xmlns:w16="http://schemas.microsoft.com/office/word/2018/wordml" xmlns:w16du="http://schemas.microsoft.com/office/word/2023/wordml/word16du" xmlns:w16sdtdh="http://schemas.microsoft.com/office/word/2020/wordml/sdtdatahash" xmlns:w16sdtfl="http://schemas.microsoft.com/office/word/2024/wordml/sdtformatlock" xmlns:w16se="http://schemas.microsoft.com/office/word/2015/wordml/symex" xmlns:wpg="http://schemas.microsoft.com/office/word/2010/wordprocessingGroup" xmlns:wpi="http://schemas.microsoft.com/office/word/2010/wordprocessingInk" xmlns:wne="http://schemas.microsoft.com/office/word/2006/wordml" xmlns:wps="http://schemas.microsoft.com/office/word/2010/wordprocessingShape" mc:Ignorable="w14 w15 w16se w16cid w16 w16cex w16sdtdh w16sdtfl w16du wp14">
   <w:body>
     <w:tbl>
@@ -179,7 +273,7 @@
                 <w:sz w:val="24"/>
                 <w:szCs w:val="24"/>
               </w:rPr>
-              <w:t>Số:       /QĐ-NPSC</w:t>
+              <w:t>Số: {so_qd}/QĐ-NPSC</w:t>
             </w:r>
           </w:p>
         </w:tc>
@@ -313,7 +407,7 @@
                 <w:sz w:val="24"/>
                 <w:szCs w:val="24"/>
               </w:rPr>
-              <w:t>Hà Nội, ngày      tháng      năm 2026</w:t>
+              <w:t>Hà Nội, {ngay_ban_hanh_chu}</w:t>
             </w:r>
           </w:p>
         </w:tc>
@@ -364,7 +458,7 @@
           <w:color w:val="EE0000"/>
           <w:sz w:val="24"/>
         </w:rPr>
-        <w:t>[Tên Xí nghiệp]</w:t>
+        <w:t>{ten_xi_nghiep}</w:t>
       </w:r>
       <w:r>
         <w:rPr>
@@ -382,7 +476,7 @@
           <w:color w:val="EE0000"/>
           <w:sz w:val="24"/>
         </w:rPr>
-        <w:t xml:space="preserve">[Số lượng] </w:t>
+        <w:t xml:space="preserve">{so_luong_cong_trinh} </w:t>
       </w:r>
       <w:r>
         <w:rPr>
@@ -399,7 +493,7 @@
           <w:sz w:val="24"/>
         </w:rPr>
         <w:br/>
-        <w:t xml:space="preserve">năm 2027 </w:t>
+        <w:t xml:space="preserve">năm {nam_ke_hoach} </w:t>
       </w:r>
       <w:r>
         <w:rPr>
@@ -408,7 +502,7 @@
           <w:color w:val="EE0000"/>
           <w:sz w:val="24"/>
         </w:rPr>
-        <w:t xml:space="preserve">[bổ sung] </w:t>
+        <w:t xml:space="preserve">{ghi_chu_bo_sung} </w:t>
       </w:r>
       <w:r>
         <w:rPr>
@@ -425,25 +519,7 @@
           <w:color w:val="EE0000"/>
           <w:sz w:val="24"/>
         </w:rPr>
-        <w:t xml:space="preserve">[Tên </w:t>
-      </w:r>
-      <w:r>
-        <w:rPr>
-          <w:rFonts w:ascii="Times New Roman" w:hAnsi="Times New Roman"/>
-          <w:b/>
-          <w:color w:val="EE0000"/>
-          <w:sz w:val="24"/>
-        </w:rPr>
-        <w:t>Điện lực tỉnh</w:t>
-      </w:r>
-      <w:r>
-        <w:rPr>
-          <w:rFonts w:ascii="Times New Roman" w:hAnsi="Times New Roman"/>
-          <w:b/>
-          <w:color w:val="EE0000"/>
-          <w:sz w:val="24"/>
-        </w:rPr>
-        <w:t>]</w:t>
+        <w:t xml:space="preserve">{ten_pc_tinh}</w:t>
       </w:r>
     </w:p>
     <w:p>
@@ -550,7 +626,7 @@
           <w:sz w:val="26"/>
           <w:szCs w:val="26"/>
         </w:rPr>
-        <w:t>[Số QĐ thành lập xí nghiệp]</w:t>
+        <w:t>{so_qd_thanh_lap_xn}</w:t>
       </w:r>
       <w:r>
         <w:rPr>
@@ -569,7 +645,7 @@
           <w:sz w:val="26"/>
           <w:szCs w:val="26"/>
         </w:rPr>
-        <w:t xml:space="preserve">[Ngày QĐ] </w:t>
+        <w:t xml:space="preserve">{ngay_qd_thanh_lap_xn} </w:t>
       </w:r>
       <w:r>
         <w:rPr>
@@ -588,7 +664,7 @@
           <w:sz w:val="26"/>
           <w:szCs w:val="26"/>
         </w:rPr>
-        <w:t xml:space="preserve">[Tên Xí nghiệp] </w:t>
+        <w:t xml:space="preserve">{ten_xi_nghiep} </w:t>
       </w:r>
       <w:r>
         <w:rPr>
@@ -629,7 +705,7 @@
           <w:sz w:val="26"/>
           <w:szCs w:val="26"/>
         </w:rPr>
-        <w:t xml:space="preserve">[Số QĐ giao KHV] </w:t>
+        <w:t xml:space="preserve">{so_qd_tam_giao_khv} </w:t>
       </w:r>
       <w:r>
         <w:rPr>
@@ -648,7 +724,7 @@
           <w:sz w:val="26"/>
           <w:szCs w:val="26"/>
         </w:rPr>
-        <w:t xml:space="preserve">[Ngày QĐ] </w:t>
+        <w:t xml:space="preserve">{ngay_qd_tam_giao_khv} </w:t>
       </w:r>
       <w:r>
         <w:rPr>
@@ -667,7 +743,7 @@
           <w:sz w:val="26"/>
           <w:szCs w:val="26"/>
         </w:rPr>
-        <w:t xml:space="preserve">[bổ sung] </w:t>
+        <w:t xml:space="preserve">{ghi_chu_bo_sung} </w:t>
       </w:r>
       <w:r>
         <w:rPr>
@@ -676,7 +752,7 @@
           <w:sz w:val="26"/>
           <w:szCs w:val="26"/>
         </w:rPr>
-        <w:t xml:space="preserve">năm 2027 cho Công ty Điện lực </w:t>
+        <w:t xml:space="preserve">năm {nam_ke_hoach} cho Công ty Điện lực </w:t>
       </w:r>
       <w:r>
         <w:rPr>
@@ -686,27 +762,7 @@
           <w:sz w:val="26"/>
           <w:szCs w:val="26"/>
         </w:rPr>
-        <w:t xml:space="preserve">[Tên PC </w:t>
-      </w:r>
-      <w:r>
-        <w:rPr>
-          <w:rFonts w:ascii="Times New Roman" w:hAnsi="Times New Roman"/>
-          <w:i/>
-          <w:color w:val="EE0000"/>
-          <w:sz w:val="26"/>
-          <w:szCs w:val="26"/>
-        </w:rPr>
-        <w:t>tỉnh</w:t>
-      </w:r>
-      <w:r>
-        <w:rPr>
-          <w:rFonts w:ascii="Times New Roman" w:hAnsi="Times New Roman"/>
-          <w:i/>
-          <w:color w:val="EE0000"/>
-          <w:sz w:val="26"/>
-          <w:szCs w:val="26"/>
-        </w:rPr>
-        <w:t>]</w:t>
+        <w:t xml:space="preserve">{ten_pc_tinh}</w:t>
       </w:r>
       <w:r>
         <w:rPr>
@@ -812,7 +868,7 @@
           <w:sz w:val="26"/>
           <w:szCs w:val="26"/>
         </w:rPr>
-        <w:t xml:space="preserve">[Tên Xí nghiệp] </w:t>
+        <w:t xml:space="preserve">{ten_xi_nghiep} </w:t>
       </w:r>
       <w:r>
         <w:rPr>
@@ -829,7 +885,7 @@
           <w:sz w:val="26"/>
           <w:szCs w:val="26"/>
         </w:rPr>
-        <w:t xml:space="preserve">[Số lượng] </w:t>
+        <w:t xml:space="preserve">{so_luong_cong_trinh} </w:t>
       </w:r>
       <w:r>
         <w:rPr>
@@ -837,7 +893,7 @@
           <w:sz w:val="26"/>
           <w:szCs w:val="26"/>
         </w:rPr>
-        <w:t xml:space="preserve">công trình ĐTXD năm 2027 </w:t>
+        <w:t xml:space="preserve">công trình ĐTXD năm {nam_ke_hoach} </w:t>
       </w:r>
       <w:r>
         <w:rPr>
@@ -846,7 +902,7 @@
           <w:sz w:val="26"/>
           <w:szCs w:val="26"/>
         </w:rPr>
-        <w:t>[hoặc ĐTXD bổ sung năm 2027]</w:t>
+        <w:t>{ghi_chu_bo_sung_dieu1}</w:t>
       </w:r>
       <w:r>
         <w:rPr>
@@ -863,25 +919,7 @@
           <w:sz w:val="26"/>
           <w:szCs w:val="26"/>
         </w:rPr>
-        <w:t xml:space="preserve">[Tên PC </w:t>
-      </w:r>
-      <w:r>
-        <w:rPr>
-          <w:rFonts w:ascii="Times New Roman" w:hAnsi="Times New Roman"/>
-          <w:color w:val="EE0000"/>
-          <w:sz w:val="26"/>
-          <w:szCs w:val="26"/>
-        </w:rPr>
-        <w:t>tỉnh</w:t>
-      </w:r>
-      <w:r>
-        <w:rPr>
-          <w:rFonts w:ascii="Times New Roman" w:hAnsi="Times New Roman"/>
-          <w:color w:val="EE0000"/>
-          <w:sz w:val="26"/>
-          <w:szCs w:val="26"/>
-        </w:rPr>
-        <w:t>]</w:t>
+        <w:t xml:space="preserve">{ten_pc_tinh}</w:t>
       </w:r>
       <w:r>
         <w:rPr>
@@ -954,25 +992,7 @@
           <w:sz w:val="26"/>
           <w:szCs w:val="26"/>
         </w:rPr>
-        <w:t xml:space="preserve">[Tên PC </w:t>
-      </w:r>
-      <w:r>
-        <w:rPr>
-          <w:rFonts w:ascii="Times New Roman" w:hAnsi="Times New Roman"/>
-          <w:color w:val="EE0000"/>
-          <w:sz w:val="26"/>
-          <w:szCs w:val="26"/>
-        </w:rPr>
-        <w:t>tỉnh</w:t>
-      </w:r>
-      <w:r>
-        <w:rPr>
-          <w:rFonts w:ascii="Times New Roman" w:hAnsi="Times New Roman"/>
-          <w:color w:val="EE0000"/>
-          <w:sz w:val="26"/>
-          <w:szCs w:val="26"/>
-        </w:rPr>
-        <w:t xml:space="preserve">] </w:t>
+        <w:t xml:space="preserve">{ten_pc_tinh} </w:t>
       </w:r>
       <w:r>
         <w:rPr>
@@ -1036,7 +1056,7 @@
           <w:sz w:val="26"/>
           <w:szCs w:val="26"/>
         </w:rPr>
-        <w:t xml:space="preserve">[Tên Xí nghiệp] </w:t>
+        <w:t xml:space="preserve">{ten_xi_nghiep} </w:t>
       </w:r>
       <w:r>
         <w:rPr>
@@ -1137,7 +1157,7 @@
               <w:rPr>
                 <w:rFonts w:ascii="Times New Roman" w:hAnsi="Times New Roman"/>
               </w:rPr>
-              <w:t>- XNDVĐL [Tên Xí nghiệp] (để t/h);</w:t>
+              <w:t>- XNDVĐL {ten_xi_nghiep} (để t/h);</w:t>
             </w:r>
           </w:p>
           <w:p>
@@ -1310,7 +1330,7 @@
           <w:color w:val="EE0000"/>
           <w:sz w:val="26"/>
         </w:rPr>
-        <w:t>DANH MỤC CÔNG TRÌNH / KẾ HOẠCH ĐTXD NĂM 2027 [BỔ SUNG]</w:t>
+        <w:t>DANH MỤC CÔNG TRÌNH / KẾ HOẠCH ĐTXD NĂM 2027 {ghi_chu_bo_sung}</w:t>
       </w:r>
       <w:r>
         <w:rPr>
@@ -1319,7 +1339,7 @@
           <w:color w:val="EE0000"/>
           <w:sz w:val="26"/>
         </w:rPr>
-        <w:t xml:space="preserve"> – CÔNG TY ĐIỆN LỰC TỈNH [PC TỈNH]</w:t>
+        <w:t xml:space="preserve"> – CÔNG TY ĐIỆN LỰC TỈNH {ten_pc_tinh}</w:t>
       </w:r>
     </w:p>
     <w:p>
@@ -1333,7 +1353,7 @@
           <w:i/>
           <w:sz w:val="21"/>
         </w:rPr>
-        <w:t>*(Kèm theo Quyết định số:       /QĐ-NPSC ngày      tháng      năm 2026 của Công ty Dịch vụ Điện lực miền Bắc)*</w:t>
+        <w:t>*(Kèm theo Quyết định số: {so_qd}/QĐ-NPSC ngày {ngay_ban_hanh_chu} của Công ty Dịch vụ Điện lực miền Bắc)*</w:t>
       </w:r>
     </w:p>
     <w:p>
@@ -1863,7 +1883,7 @@
                 <w:b/>
                 <w:color w:val="EE0000"/>
               </w:rPr>
-              <w:t>[Tổng TMĐT]</w:t>
+              <w:t>{tong_tmdt}</w:t>
             </w:r>
           </w:p>
         </w:tc>
@@ -1893,7 +1913,7 @@
                 <w:b/>
                 <w:color w:val="EE0000"/>
               </w:rPr>
-              <w:t>[Tổng]</w:t>
+              <w:t>{tong_khv}</w:t>
             </w:r>
           </w:p>
         </w:tc>
@@ -1923,7 +1943,7 @@
                 <w:b/>
                 <w:color w:val="EE0000"/>
               </w:rPr>
-              <w:t>[TDTM]</w:t>
+              <w:t>{tong_tdtm}</w:t>
             </w:r>
           </w:p>
         </w:tc>
@@ -1953,7 +1973,7 @@
                 <w:b/>
                 <w:color w:val="EE0000"/>
               </w:rPr>
-              <w:t>[KHCB]</w:t>
+              <w:t>{tong_khcb}</w:t>
             </w:r>
           </w:p>
         </w:tc>
@@ -2030,7 +2050,7 @@
               <w:rPr>
                 <w:rFonts w:ascii="Times New Roman" w:hAnsi="Times New Roman" w:cs="Times New Roman"/>
               </w:rPr>
-              <w:t>Dự án mẫu 1: Xây dựng và cải tạo đường dây trung, hạ áp khu vực A năm 2027</w:t>
+              <w:t>Dự án mẫu 1: Xây dựng và cải tạo đường dây trung, hạ áp khu vực A năm {nam_ke_hoach}</w:t>
             </w:r>
           </w:p>
         </w:tc>
@@ -2444,7 +2464,7 @@
                 <w:rFonts w:ascii="Times New Roman" w:hAnsi="Times New Roman" w:cs="Times New Roman"/>
                 <w:i/>
               </w:rPr>
-              <w:t>[Thêm các công trình khác tương tự vào đây]</w:t>
+              <w:t/>
             </w:r>
           </w:p>
         </w:tc>
@@ -2649,7 +2669,7 @@
           <w:rFonts w:ascii="Times New Roman" w:hAnsi="Times New Roman"/>
           <w:sz w:val="19"/>
         </w:rPr>
-        <w:t>- Yêu cầu các đơn vị ưu tiên sử dụng các MBA ngoài lưới hiện có tại đơn vị hoặc điều chuyển nội bộ Tổng công ty sử dụng cho các danh mục năm 2027, chỉ xem xét kế hoạch mua sắm mới sau khi đã tận dụng hết nguồn MBA ngoài lưới phù hợp với dự án đảm bảo mục tiêu tiết kiệm, tránh lãng phí.</w:t>
+        <w:t>- Yêu cầu các đơn vị ưu tiên sử dụng các MBA ngoài lưới hiện có tại đơn vị hoặc điều chuyển nội bộ Tổng công ty sử dụng cho các danh mục năm {nam_ke_hoach}, chỉ xem xét kế hoạch mua sắm mới sau khi đã tận dụng hết nguồn MBA ngoài lưới phù hợp với dự án đảm bảo mục tiêu tiết kiệm, tránh lãng phí.</w:t>
       </w:r>
     </w:p>
     <w:sectPr>
@@ -2662,7 +2682,62 @@
 </w:document>
 </file>
 
-<file path=word/numbering.xml><?xml version="1.0" encoding="utf-8"?>
+<file path=word\fontTable.xml><?xml version="1.0" encoding="utf-8"?>
+<w:fonts xmlns:mc="http://schemas.openxmlformats.org/markup-compatibility/2006" xmlns:r="http://schemas.openxmlformats.org/officeDocument/2006/relationships" xmlns:w="http://schemas.openxmlformats.org/wordprocessingml/2006/main" xmlns:w14="http://schemas.microsoft.com/office/word/2010/wordml" xmlns:w15="http://schemas.microsoft.com/office/word/2012/wordml" xmlns:w16cex="http://schemas.microsoft.com/office/word/2018/wordml/cex" xmlns:w16cid="http://schemas.microsoft.com/office/word/2016/wordml/cid" xmlns:w16="http://schemas.microsoft.com/office/word/2018/wordml" xmlns:w16du="http://schemas.microsoft.com/office/word/2023/wordml/word16du" xmlns:w16sdtdh="http://schemas.microsoft.com/office/word/2020/wordml/sdtdatahash" xmlns:w16sdtfl="http://schemas.microsoft.com/office/word/2024/wordml/sdtformatlock" xmlns:w16se="http://schemas.microsoft.com/office/word/2015/wordml/symex" mc:Ignorable="w14 w15 w16se w16cid w16 w16cex w16sdtdh w16sdtfl w16du">
+  <w:font w:name="Symbol">
+    <w:panose1 w:val="05050102010706020507"/>
+    <w:charset w:val="02"/>
+    <w:family w:val="roman"/>
+    <w:pitch w:val="variable"/>
+    <w:sig w:usb0="00000000" w:usb1="10000000" w:usb2="00000000" w:usb3="00000000" w:csb0="80000000" w:csb1="00000000"/>
+  </w:font>
+  <w:font w:name="Times New Roman">
+    <w:panose1 w:val="02020603050405020304"/>
+    <w:charset w:val="00"/>
+    <w:family w:val="roman"/>
+    <w:pitch w:val="variable"/>
+    <w:sig w:usb0="E0002EFF" w:usb1="C000785B" w:usb2="00000009" w:usb3="00000000" w:csb0="000001FF" w:csb1="00000000"/>
+  </w:font>
+  <w:font w:name="Cambria">
+    <w:panose1 w:val="02040503050406030204"/>
+    <w:charset w:val="00"/>
+    <w:family w:val="roman"/>
+    <w:pitch w:val="variable"/>
+    <w:sig w:usb0="E00006FF" w:usb1="420024FF" w:usb2="02000000" w:usb3="00000000" w:csb0="0000019F" w:csb1="00000000"/>
+  </w:font>
+  <w:font w:name="MS Mincho">
+    <w:panose1 w:val="02020609040205080304"/>
+    <w:charset w:val="80"/>
+    <w:family w:val="modern"/>
+    <w:pitch w:val="fixed"/>
+    <w:sig w:usb0="E00002FF" w:usb1="6AC7FDFB" w:usb2="08000012" w:usb3="00000000" w:csb0="0002009F" w:csb1="00000000"/>
+  </w:font>
+  <w:font w:name="Calibri">
+    <w:panose1 w:val="020F0502020204030204"/>
+    <w:charset w:val="00"/>
+    <w:family w:val="swiss"/>
+    <w:pitch w:val="variable"/>
+    <w:sig w:usb0="E4002EFF" w:usb1="C200247B" w:usb2="00000009" w:usb3="00000000" w:csb0="000001FF" w:csb1="00000000"/>
+  </w:font>
+  <w:font w:name="MS Gothic">
+    <w:altName w:val="ＭＳ ゴシック"/>
+    <w:panose1 w:val="020B0609070205080204"/>
+    <w:charset w:val="80"/>
+    <w:family w:val="modern"/>
+    <w:pitch w:val="fixed"/>
+    <w:sig w:usb0="E00002FF" w:usb1="6AC7FDFB" w:usb2="08000012" w:usb3="00000000" w:csb0="0002009F" w:csb1="00000000"/>
+  </w:font>
+  <w:font w:name="Courier">
+    <w:panose1 w:val="02070409020205020404"/>
+    <w:charset w:val="00"/>
+    <w:family w:val="auto"/>
+    <w:pitch w:val="variable"/>
+    <w:sig w:usb0="00000003" w:usb1="00000000" w:usb2="00000000" w:usb3="00000000" w:csb0="00000001" w:csb1="00000000"/>
+  </w:font>
+</w:fonts>
+</file>
+
+<file path=word\numbering.xml><?xml version="1.0" encoding="utf-8"?>
 <w:numbering xmlns:wpc="http://schemas.microsoft.com/office/word/2010/wordprocessingCanvas" xmlns:cx="http://schemas.microsoft.com/office/drawing/2014/chartex" xmlns:cx1="http://schemas.microsoft.com/office/drawing/2015/9/8/chartex" xmlns:cx2="http://schemas.microsoft.com/office/drawing/2015/10/21/chartex" xmlns:cx3="http://schemas.microsoft.com/office/drawing/2016/5/9/chartex" xmlns:cx4="http://schemas.microsoft.com/office/drawing/2016/5/10/chartex" xmlns:cx5="http://schemas.microsoft.com/office/drawing/2016/5/11/chartex" xmlns:cx6="http://schemas.microsoft.com/office/drawing/2016/5/12/chartex" xmlns:cx7="http://schemas.microsoft.com/office/drawing/2016/5/13/chartex" xmlns:cx8="http://schemas.microsoft.com/office/drawing/2016/5/14/chartex" xmlns:mc="http://schemas.openxmlformats.org/markup-compatibility/2006" xmlns:aink="http://schemas.microsoft.com/office/drawing/2016/ink" xmlns:am3d="http://schemas.microsoft.com/office/drawing/2017/model3d" xmlns:o="urn:schemas-microsoft-com:office:office" xmlns:oel="http://schemas.microsoft.com/office/2019/extlst" xmlns:r="http://schemas.openxmlformats.org/officeDocument/2006/relationships" xmlns:m="http://schemas.openxmlformats.org/officeDocument/2006/math" xmlns:v="urn:schemas-microsoft-com:vml" xmlns:wp14="http://schemas.microsoft.com/office/word/2010/wordprocessingDrawing" xmlns:wp="http://schemas.openxmlformats.org/drawingml/2006/wordprocessingDrawing" xmlns:w10="urn:schemas-microsoft-com:office:word" xmlns:w="http://schemas.openxmlformats.org/wordprocessingml/2006/main" xmlns:w14="http://schemas.microsoft.com/office/word/2010/wordml" xmlns:w15="http://schemas.microsoft.com/office/word/2012/wordml" xmlns:w16cex="http://schemas.microsoft.com/office/word/2018/wordml/cex" xmlns:w16cid="http://schemas.microsoft.com/office/word/2016/wordml/cid" xmlns:w16="http://schemas.microsoft.com/office/word/2018/wordml" xmlns:w16du="http://schemas.microsoft.com/office/word/2023/wordml/word16du" xmlns:w16sdtdh="http://schemas.microsoft.com/office/word/2020/wordml/sdtdatahash" xmlns:w16sdtfl="http://schemas.microsoft.com/office/word/2024/wordml/sdtformatlock" xmlns:w16se="http://schemas.microsoft.com/office/word/2015/wordml/symex" xmlns:wpg="http://schemas.microsoft.com/office/word/2010/wordprocessingGroup" xmlns:wpi="http://schemas.microsoft.com/office/word/2010/wordprocessingInk" xmlns:wne="http://schemas.microsoft.com/office/word/2006/wordml" xmlns:wps="http://schemas.microsoft.com/office/word/2010/wordprocessingShape" mc:Ignorable="w14 w15 w16se w16cid w16 w16cex w16sdtdh w16sdtfl w16du wp14">
   <w:abstractNum w:abstractNumId="0" w15:restartNumberingAfterBreak="0">
     <w:nsid w:val="FFFFFF7C"/>
@@ -2865,7 +2940,68 @@
 </w:numbering>
 </file>
 
-<file path=word/styles.xml><?xml version="1.0" encoding="utf-8"?>
+<file path=word\settings.xml><?xml version="1.0" encoding="utf-8"?>
+<w:settings xmlns:mc="http://schemas.openxmlformats.org/markup-compatibility/2006" xmlns:o="urn:schemas-microsoft-com:office:office" xmlns:r="http://schemas.openxmlformats.org/officeDocument/2006/relationships" xmlns:m="http://schemas.openxmlformats.org/officeDocument/2006/math" xmlns:v="urn:schemas-microsoft-com:vml" xmlns:w10="urn:schemas-microsoft-com:office:word" xmlns:w="http://schemas.openxmlformats.org/wordprocessingml/2006/main" xmlns:w14="http://schemas.microsoft.com/office/word/2010/wordml" xmlns:w15="http://schemas.microsoft.com/office/word/2012/wordml" xmlns:w16cex="http://schemas.microsoft.com/office/word/2018/wordml/cex" xmlns:w16cid="http://schemas.microsoft.com/office/word/2016/wordml/cid" xmlns:w16="http://schemas.microsoft.com/office/word/2018/wordml" xmlns:w16du="http://schemas.microsoft.com/office/word/2023/wordml/word16du" xmlns:w16sdtdh="http://schemas.microsoft.com/office/word/2020/wordml/sdtdatahash" xmlns:w16sdtfl="http://schemas.microsoft.com/office/word/2024/wordml/sdtformatlock" xmlns:w16se="http://schemas.microsoft.com/office/word/2015/wordml/symex" xmlns:sl="http://schemas.openxmlformats.org/schemaLibrary/2006/main" mc:Ignorable="w14 w15 w16se w16cid w16 w16cex w16sdtdh w16sdtfl w16du">
+  <w:zoom w:percent="100"/>
+  <w:defaultTabStop w:val="720"/>
+  <w:characterSpacingControl w:val="doNotCompress"/>
+  <w:compat>
+    <w:useFELayout/>
+    <w:compatSetting w:name="compatibilityMode" w:uri="http://schemas.microsoft.com/office/word" w:val="14"/>
+    <w:compatSetting w:name="overrideTableStyleFontSizeAndJustification" w:uri="http://schemas.microsoft.com/office/word" w:val="1"/>
+    <w:compatSetting w:name="enableOpenTypeFeatures" w:uri="http://schemas.microsoft.com/office/word" w:val="1"/>
+    <w:compatSetting w:name="doNotFlipMirrorIndents" w:uri="http://schemas.microsoft.com/office/word" w:val="1"/>
+    <w:compatSetting w:name="useWord2013TrackBottomHyphenation" w:uri="http://schemas.microsoft.com/office/word" w:val="1"/>
+  </w:compat>
+  <w:rsids>
+    <w:rsidRoot w:val="00B47730"/>
+    <w:rsid w:val="00034616"/>
+    <w:rsid w:val="0006063C"/>
+    <w:rsid w:val="0015074B"/>
+    <w:rsid w:val="001E0EED"/>
+    <w:rsid w:val="0029639D"/>
+    <w:rsid w:val="00326F90"/>
+    <w:rsid w:val="00661875"/>
+    <w:rsid w:val="009A2188"/>
+    <w:rsid w:val="00AA1D8D"/>
+    <w:rsid w:val="00B47730"/>
+    <w:rsid w:val="00C6096D"/>
+    <w:rsid w:val="00CB0664"/>
+    <w:rsid w:val="00E735EC"/>
+    <w:rsid w:val="00F84413"/>
+    <w:rsid w:val="00FC693F"/>
+  </w:rsids>
+  <m:mathPr>
+    <m:mathFont m:val="Cambria Math"/>
+    <m:brkBin m:val="before"/>
+    <m:brkBinSub m:val="--"/>
+    <m:smallFrac m:val="0"/>
+    <m:dispDef/>
+    <m:lMargin m:val="0"/>
+    <m:rMargin m:val="0"/>
+    <m:defJc m:val="centerGroup"/>
+    <m:wrapIndent m:val="1440"/>
+    <m:intLim m:val="subSup"/>
+    <m:naryLim m:val="undOvr"/>
+  </m:mathPr>
+  <w:themeFontLang w:val="en-US" w:eastAsia="ja-JP"/>
+  <w:clrSchemeMapping w:bg1="light1" w:t1="dark1" w:bg2="light2" w:t2="dark2" w:accent1="accent1" w:accent2="accent2" w:accent3="accent3" w:accent4="accent4" w:accent5="accent5" w:accent6="accent6" w:hyperlink="hyperlink" w:followedHyperlink="followedHyperlink"/>
+  <w:doNotAutoCompressPictures/>
+  <w:shapeDefaults>
+    <o:shapedefaults v:ext="edit" spidmax="1026"/>
+    <o:shapelayout v:ext="edit">
+      <o:idmap v:ext="edit" data="1"/>
+    </o:shapelayout>
+  </w:shapeDefaults>
+  <w:decimalSymbol w:val="."/>
+  <w:listSeparator w:val=","/>
+  <w14:docId w14:val="7A2DA5BC"/>
+  <w14:defaultImageDpi w14:val="300"/>
+  <w15:docId w15:val="{12388355-C3A8-45F8-AC78-4727EBD4DB7C}"/>
+</w:settings>
+</file>
+
+<file path=word\styles.xml><?xml version="1.0" encoding="utf-8"?>
 <w:styles xmlns:mc="http://schemas.openxmlformats.org/markup-compatibility/2006" xmlns:r="http://schemas.openxmlformats.org/officeDocument/2006/relationships" xmlns:w="http://schemas.openxmlformats.org/wordprocessingml/2006/main" xmlns:w14="http://schemas.microsoft.com/office/word/2010/wordml" xmlns:w15="http://schemas.microsoft.com/office/word/2012/wordml" xmlns:w16cex="http://schemas.microsoft.com/office/word/2018/wordml/cex" xmlns:w16cid="http://schemas.microsoft.com/office/word/2016/wordml/cid" xmlns:w16="http://schemas.microsoft.com/office/word/2018/wordml" xmlns:w16du="http://schemas.microsoft.com/office/word/2023/wordml/word16du" xmlns:w16sdtdh="http://schemas.microsoft.com/office/word/2020/wordml/sdtdatahash" xmlns:w16sdtfl="http://schemas.microsoft.com/office/word/2024/wordml/sdtformatlock" xmlns:w16se="http://schemas.microsoft.com/office/word/2015/wordml/symex" mc:Ignorable="w14 w15 w16se w16cid w16 w16cex w16sdtdh w16sdtfl w16du">
   <w:docDefaults>
     <w:rPrDefault>
@@ -14248,7 +14384,7 @@
 </w:styles>
 </file>
 
-<file path=word/theme/theme1.xml><?xml version="1.0" encoding="utf-8"?>
+<file path=word\theme\theme1.xml><?xml version="1.0" encoding="utf-8"?>
 <a:theme xmlns:a="http://schemas.openxmlformats.org/drawingml/2006/main" name="Office Theme">
   <a:themeElements>
     <a:clrScheme name="Office">
@@ -14568,14 +14704,8 @@
 </a:theme>
 </file>
 
-<file path=customXml/item1.xml><?xml version="1.0" encoding="utf-8"?>
-<b:Sources xmlns:b="http://schemas.openxmlformats.org/officeDocument/2006/bibliography" xmlns="http://schemas.openxmlformats.org/officeDocument/2006/bibliography" SelectedStyle="/APA.XSL" StyleName="APA"/>
-</file>
-
-<file path=customXml/itemProps1.xml><?xml version="1.0" encoding="utf-8"?>
-<ds:datastoreItem xmlns:ds="http://schemas.openxmlformats.org/officeDocument/2006/customXml" ds:itemID="{EF278816-EC6F-A645-907D-7F25AECB1D4A}">
-  <ds:schemaRefs>
-    <ds:schemaRef ds:uri="http://schemas.openxmlformats.org/officeDocument/2006/bibliography"/>
-  </ds:schemaRefs>
-</ds:datastoreItem>
+<file path=word\webSettings.xml><?xml version="1.0" encoding="utf-8"?>
+<w:webSettings xmlns:mc="http://schemas.openxmlformats.org/markup-compatibility/2006" xmlns:r="http://schemas.openxmlformats.org/officeDocument/2006/relationships" xmlns:w="http://schemas.openxmlformats.org/wordprocessingml/2006/main" xmlns:w14="http://schemas.microsoft.com/office/word/2010/wordml" xmlns:w15="http://schemas.microsoft.com/office/word/2012/wordml" xmlns:w16cex="http://schemas.microsoft.com/office/word/2018/wordml/cex" xmlns:w16cid="http://schemas.microsoft.com/office/word/2016/wordml/cid" xmlns:w16="http://schemas.microsoft.com/office/word/2018/wordml" xmlns:w16du="http://schemas.microsoft.com/office/word/2023/wordml/word16du" xmlns:w16sdtdh="http://schemas.microsoft.com/office/word/2020/wordml/sdtdatahash" xmlns:w16sdtfl="http://schemas.microsoft.com/office/word/2024/wordml/sdtformatlock" xmlns:w16se="http://schemas.microsoft.com/office/word/2015/wordml/symex" mc:Ignorable="w14 w15 w16se w16cid w16 w16cex w16sdtdh w16sdtfl w16du">
+  <w:allowPNG/>
+</w:webSettings>
 </file>
</xml_diff>

<commit_message>
Đóng phiên: soạn QĐ (form/L1/PC tỉnh/theme), auth-hệ thống, SQL 005–009.
Ổn định UX soạn giao XN và đồng bộ HANDOFF/workflow/HDSD; kèm auth, quản trị NS/XN và phụ lục Giao A đã làm dở trên máy.

Co-authored-by: Cursor <cursoragent@cursor.com>
</commit_message>
<xml_diff>
--- a/public/templates/qd-giao-nhiem-vu-tnhc.docx
+++ b/public/templates/qd-giao-nhiem-vu-tnhc.docx
@@ -1,99 +1,5 @@
 
-<file path=customXml\item1.xml><?xml version="1.0" encoding="utf-8"?>
-<b:Sources xmlns:b="http://schemas.openxmlformats.org/officeDocument/2006/bibliography" xmlns="http://schemas.openxmlformats.org/officeDocument/2006/bibliography" SelectedStyle="/APA.XSL" StyleName="APA"/>
-</file>
-
-<file path=customXml\itemProps1.xml><?xml version="1.0" encoding="utf-8"?>
-<ds:datastoreItem xmlns:ds="http://schemas.openxmlformats.org/officeDocument/2006/customXml" ds:itemID="{EF278816-EC6F-A645-907D-7F25AECB1D4A}">
-  <ds:schemaRefs>
-    <ds:schemaRef ds:uri="http://schemas.openxmlformats.org/officeDocument/2006/bibliography"/>
-  </ds:schemaRefs>
-</ds:datastoreItem>
-</file>
-
-<file path=docProps\app.xml><?xml version="1.0" encoding="utf-8"?>
-<Properties xmlns="http://schemas.openxmlformats.org/officeDocument/2006/extended-properties" xmlns:vt="http://schemas.openxmlformats.org/officeDocument/2006/docPropsVTypes">
-  <Template>Normal.dotm</Template>
-  <TotalTime>15</TotalTime>
-  <Pages>3</Pages>
-  <Words>572</Words>
-  <Characters>3266</Characters>
-  <Application>Microsoft Office Word</Application>
-  <DocSecurity>0</DocSecurity>
-  <Lines>27</Lines>
-  <Paragraphs>7</Paragraphs>
-  <ScaleCrop>false</ScaleCrop>
-  <HeadingPairs>
-    <vt:vector size="2" baseType="variant">
-      <vt:variant>
-        <vt:lpstr>Title</vt:lpstr>
-      </vt:variant>
-      <vt:variant>
-        <vt:i4>1</vt:i4>
-      </vt:variant>
-    </vt:vector>
-  </HeadingPairs>
-  <TitlesOfParts>
-    <vt:vector size="1" baseType="lpstr">
-      <vt:lpstr/>
-    </vt:vector>
-  </TitlesOfParts>
-  <Manager/>
-  <Company/>
-  <LinksUpToDate>false</LinksUpToDate>
-  <CharactersWithSpaces>3831</CharactersWithSpaces>
-  <SharedDoc>false</SharedDoc>
-  <HyperlinkBase/>
-  <HyperlinksChanged>false</HyperlinksChanged>
-  <AppVersion>16.0000</AppVersion>
-</Properties>
-</file>
-
-<file path=docProps\core.xml><?xml version="1.0" encoding="utf-8"?>
-<cp:coreProperties xmlns:cp="http://schemas.openxmlformats.org/package/2006/metadata/core-properties" xmlns:dc="http://purl.org/dc/elements/1.1/" xmlns:dcterms="http://purl.org/dc/terms/" xmlns:dcmitype="http://purl.org/dc/dcmitype/" xmlns:xsi="http://www.w3.org/2001/XMLSchema-instance">
-  <dc:title/>
-  <dc:subject/>
-  <dc:creator>python-docx</dc:creator>
-  <cp:keywords/>
-  <dc:description>generated by python-docx</dc:description>
-  <cp:lastModifiedBy>Phương Đỗ Minh</cp:lastModifiedBy>
-  <cp:revision>3</cp:revision>
-  <dcterms:created xsi:type="dcterms:W3CDTF">2013-12-23T23:15:00Z</dcterms:created>
-  <dcterms:modified xsi:type="dcterms:W3CDTF">2026-07-23T10:55:00Z</dcterms:modified>
-  <cp:category/>
-</cp:coreProperties>
-</file>
-
-<file path=docProps\custom.xml><?xml version="1.0" encoding="utf-8"?>
-<Properties xmlns="http://schemas.openxmlformats.org/officeDocument/2006/custom-properties" xmlns:vt="http://schemas.openxmlformats.org/officeDocument/2006/docPropsVTypes">
-  <property fmtid="{D5CDD505-2E9C-101B-9397-08002B2CF9AE}" pid="2" name="MSIP_Label_defa4170-0d19-0005-0004-bc88714345d2_Enabled">
-    <vt:lpwstr>true</vt:lpwstr>
-  </property>
-  <property fmtid="{D5CDD505-2E9C-101B-9397-08002B2CF9AE}" pid="3" name="MSIP_Label_defa4170-0d19-0005-0004-bc88714345d2_SetDate">
-    <vt:lpwstr>2026-07-23T10:39:17Z</vt:lpwstr>
-  </property>
-  <property fmtid="{D5CDD505-2E9C-101B-9397-08002B2CF9AE}" pid="4" name="MSIP_Label_defa4170-0d19-0005-0004-bc88714345d2_Method">
-    <vt:lpwstr>Standard</vt:lpwstr>
-  </property>
-  <property fmtid="{D5CDD505-2E9C-101B-9397-08002B2CF9AE}" pid="5" name="MSIP_Label_defa4170-0d19-0005-0004-bc88714345d2_Name">
-    <vt:lpwstr>defa4170-0d19-0005-0004-bc88714345d2</vt:lpwstr>
-  </property>
-  <property fmtid="{D5CDD505-2E9C-101B-9397-08002B2CF9AE}" pid="6" name="MSIP_Label_defa4170-0d19-0005-0004-bc88714345d2_SiteId">
-    <vt:lpwstr>6e8d75a1-703a-4f22-b366-775bd30bead6</vt:lpwstr>
-  </property>
-  <property fmtid="{D5CDD505-2E9C-101B-9397-08002B2CF9AE}" pid="7" name="MSIP_Label_defa4170-0d19-0005-0004-bc88714345d2_ActionId">
-    <vt:lpwstr>d43790e6-a607-41c0-bd2c-5f35b5be3390</vt:lpwstr>
-  </property>
-  <property fmtid="{D5CDD505-2E9C-101B-9397-08002B2CF9AE}" pid="8" name="MSIP_Label_defa4170-0d19-0005-0004-bc88714345d2_ContentBits">
-    <vt:lpwstr>0</vt:lpwstr>
-  </property>
-  <property fmtid="{D5CDD505-2E9C-101B-9397-08002B2CF9AE}" pid="9" name="MSIP_Label_defa4170-0d19-0005-0004-bc88714345d2_Tag">
-    <vt:lpwstr>10, 3, 0, 1</vt:lpwstr>
-  </property>
-</Properties>
-</file>
-
-<file path=word\document.xml><?xml version="1.0" encoding="utf-8"?>
+<file path=word/document.xml><?xml version="1.0" encoding="utf-8"?>
 <w:document xmlns:wpc="http://schemas.microsoft.com/office/word/2010/wordprocessingCanvas" xmlns:cx="http://schemas.microsoft.com/office/drawing/2014/chartex" xmlns:cx1="http://schemas.microsoft.com/office/drawing/2015/9/8/chartex" xmlns:cx2="http://schemas.microsoft.com/office/drawing/2015/10/21/chartex" xmlns:cx3="http://schemas.microsoft.com/office/drawing/2016/5/9/chartex" xmlns:cx4="http://schemas.microsoft.com/office/drawing/2016/5/10/chartex" xmlns:cx5="http://schemas.microsoft.com/office/drawing/2016/5/11/chartex" xmlns:cx6="http://schemas.microsoft.com/office/drawing/2016/5/12/chartex" xmlns:cx7="http://schemas.microsoft.com/office/drawing/2016/5/13/chartex" xmlns:cx8="http://schemas.microsoft.com/office/drawing/2016/5/14/chartex" xmlns:mc="http://schemas.openxmlformats.org/markup-compatibility/2006" xmlns:aink="http://schemas.microsoft.com/office/drawing/2016/ink" xmlns:am3d="http://schemas.microsoft.com/office/drawing/2017/model3d" xmlns:o="urn:schemas-microsoft-com:office:office" xmlns:oel="http://schemas.microsoft.com/office/2019/extlst" xmlns:r="http://schemas.openxmlformats.org/officeDocument/2006/relationships" xmlns:m="http://schemas.openxmlformats.org/officeDocument/2006/math" xmlns:v="urn:schemas-microsoft-com:vml" xmlns:wp14="http://schemas.microsoft.com/office/word/2010/wordprocessingDrawing" xmlns:wp="http://schemas.openxmlformats.org/drawingml/2006/wordprocessingDrawing" xmlns:w10="urn:schemas-microsoft-com:office:word" xmlns:w="http://schemas.openxmlformats.org/wordprocessingml/2006/main" xmlns:w14="http://schemas.microsoft.com/office/word/2010/wordml" xmlns:w15="http://schemas.microsoft.com/office/word/2012/wordml" xmlns:w16cex="http://schemas.microsoft.com/office/word/2018/wordml/cex" xmlns:w16cid="http://schemas.microsoft.com/office/word/2016/wordml/cid" xmlns:w16="http://schemas.microsoft.com/office/word/2018/wordml" xmlns:w16du="http://schemas.microsoft.com/office/word/2023/wordml/word16du" xmlns:w16sdtdh="http://schemas.microsoft.com/office/word/2020/wordml/sdtdatahash" xmlns:w16sdtfl="http://schemas.microsoft.com/office/word/2024/wordml/sdtformatlock" xmlns:w16se="http://schemas.microsoft.com/office/word/2015/wordml/symex" xmlns:wpg="http://schemas.microsoft.com/office/word/2010/wordprocessingGroup" xmlns:wpi="http://schemas.microsoft.com/office/word/2010/wordprocessingInk" xmlns:wne="http://schemas.microsoft.com/office/word/2006/wordml" xmlns:wps="http://schemas.microsoft.com/office/word/2010/wordprocessingShape" mc:Ignorable="w14 w15 w16se w16cid w16 w16cex w16sdtdh w16sdtfl w16du wp14">
   <w:body>
     <w:tbl>
@@ -223,7 +129,7 @@
                 </mc:Choice>
                 <mc:Fallback>
                   <w:pict>
-                    <v:line w14:anchorId="34409FDC" id="Straight Connector 1" o:spid="_x0000_s1026" style="position:absolute;z-index:251657216;visibility:visible;mso-wrap-style:square;mso-wrap-distance-left:9pt;mso-wrap-distance-top:0;mso-wrap-distance-right:9pt;mso-wrap-distance-bottom:0;mso-position-horizontal:absolute;mso-position-horizontal-relative:margin;mso-position-vertical:absolute;mso-position-vertical-relative:text" from="41.45pt,14.15pt" to="147.2pt,14.15pt" o:gfxdata="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" strokecolor="black [3040]" strokeweight=".5pt">
+                    <v:line w14:anchorId="76E4D3AA" id="Straight Connector 1" o:spid="_x0000_s1026" style="position:absolute;z-index:251657216;visibility:visible;mso-wrap-style:square;mso-wrap-distance-left:9pt;mso-wrap-distance-top:0;mso-wrap-distance-right:9pt;mso-wrap-distance-bottom:0;mso-position-horizontal:absolute;mso-position-horizontal-relative:margin;mso-position-vertical:absolute;mso-position-vertical-relative:text" from="41.45pt,14.15pt" to="147.2pt,14.15pt" o:gfxdata="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" strokecolor="black [3040]" strokeweight=".5pt">
                       <w10:wrap anchorx="margin"/>
                     </v:line>
                   </w:pict>
@@ -374,7 +280,7 @@
                 </mc:Choice>
                 <mc:Fallback>
                   <w:pict>
-                    <v:line w14:anchorId="47415C88" id="Straight Connector 2" o:spid="_x0000_s1026" style="position:absolute;z-index:251660288;visibility:visible;mso-wrap-style:square;mso-width-percent:0;mso-wrap-distance-left:9pt;mso-wrap-distance-top:0;mso-wrap-distance-right:9pt;mso-wrap-distance-bottom:0;mso-position-horizontal:absolute;mso-position-horizontal-relative:margin;mso-position-vertical:absolute;mso-position-vertical-relative:text;mso-width-percent:0;mso-width-relative:margin" from="56.85pt,15.3pt" to="190.75pt,15.3pt" o:gfxdata="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" strokecolor="black [3040]" strokeweight=".5pt">
+                    <v:line w14:anchorId="5CB29A88" id="Straight Connector 2" o:spid="_x0000_s1026" style="position:absolute;z-index:251660288;visibility:visible;mso-wrap-style:square;mso-width-percent:0;mso-wrap-distance-left:9pt;mso-wrap-distance-top:0;mso-wrap-distance-right:9pt;mso-wrap-distance-bottom:0;mso-position-horizontal:absolute;mso-position-horizontal-relative:margin;mso-position-vertical:absolute;mso-position-vertical-relative:text;mso-width-percent:0;mso-width-relative:margin" from="56.85pt,15.3pt" to="190.75pt,15.3pt" o:gfxdata="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" strokecolor="black [3040]" strokeweight=".5pt">
                       <w10:wrap anchorx="margin"/>
                     </v:line>
                   </w:pict>
@@ -519,7 +425,7 @@
           <w:color w:val="EE0000"/>
           <w:sz w:val="24"/>
         </w:rPr>
-        <w:t xml:space="preserve">{ten_pc_tinh}</w:t>
+        <w:t>{ten_pc_tinh}</w:t>
       </w:r>
     </w:p>
     <w:p>
@@ -762,7 +668,7 @@
           <w:sz w:val="26"/>
           <w:szCs w:val="26"/>
         </w:rPr>
-        <w:t xml:space="preserve">{ten_pc_tinh}</w:t>
+        <w:t>{ten_pc_tinh}</w:t>
       </w:r>
       <w:r>
         <w:rPr>
@@ -919,7 +825,7 @@
           <w:sz w:val="26"/>
           <w:szCs w:val="26"/>
         </w:rPr>
-        <w:t xml:space="preserve">{ten_pc_tinh}</w:t>
+        <w:t>{ten_pc_tinh}</w:t>
       </w:r>
       <w:r>
         <w:rPr>
@@ -1330,7 +1236,7 @@
           <w:color w:val="EE0000"/>
           <w:sz w:val="26"/>
         </w:rPr>
-        <w:t>DANH MỤC CÔNG TRÌNH / KẾ HOẠCH ĐTXD NĂM 2027 {ghi_chu_bo_sung}</w:t>
+        <w:t>DANH MỤC CÔNG TRÌNH / KẾ HOẠCH ĐTXD NĂM {nam_ke_hoach} {ghi_chu_bo_sung}</w:t>
       </w:r>
       <w:r>
         <w:rPr>
@@ -1385,14 +1291,14 @@
         <w:tblLook w:val="04A0" w:firstRow="1" w:lastRow="0" w:firstColumn="1" w:lastColumn="0" w:noHBand="0" w:noVBand="1"/>
       </w:tblPr>
       <w:tblGrid>
-        <w:gridCol w:w="617"/>
-        <w:gridCol w:w="2325"/>
-        <w:gridCol w:w="2839"/>
-        <w:gridCol w:w="2666"/>
-        <w:gridCol w:w="969"/>
-        <w:gridCol w:w="1007"/>
-        <w:gridCol w:w="997"/>
-        <w:gridCol w:w="1300"/>
+        <w:gridCol w:w="1894"/>
+        <w:gridCol w:w="1145"/>
+        <w:gridCol w:w="2400"/>
+        <w:gridCol w:w="700"/>
+        <w:gridCol w:w="1254"/>
+        <w:gridCol w:w="1352"/>
+        <w:gridCol w:w="1364"/>
+        <w:gridCol w:w="2566"/>
       </w:tblGrid>
       <w:tr>
         <w:trPr>
@@ -2012,6 +1918,7 @@
               <w:bottom w:w="100" w:type="dxa"/>
               <w:right w:w="100" w:type="dxa"/>
             </w:tcMar>
+            <w:vAlign w:val="center"/>
           </w:tcPr>
           <w:p>
             <w:pPr>
@@ -2025,7 +1932,7 @@
               <w:rPr>
                 <w:rFonts w:ascii="Times New Roman" w:hAnsi="Times New Roman" w:cs="Times New Roman"/>
               </w:rPr>
-              <w:t>1</w:t>
+              <w:t>{#cong_trinh}{stt}</w:t>
             </w:r>
           </w:p>
         </w:tc>
@@ -2038,6 +1945,7 @@
               <w:bottom w:w="100" w:type="dxa"/>
               <w:right w:w="100" w:type="dxa"/>
             </w:tcMar>
+            <w:vAlign w:val="center"/>
           </w:tcPr>
           <w:p>
             <w:pPr>
@@ -2050,7 +1958,7 @@
               <w:rPr>
                 <w:rFonts w:ascii="Times New Roman" w:hAnsi="Times New Roman" w:cs="Times New Roman"/>
               </w:rPr>
-              <w:t>Dự án mẫu 1: Xây dựng và cải tạo đường dây trung, hạ áp khu vực A năm {nam_ke_hoach}</w:t>
+              <w:t>{ct_ten}</w:t>
             </w:r>
           </w:p>
         </w:tc>
@@ -2063,6 +1971,7 @@
               <w:bottom w:w="100" w:type="dxa"/>
               <w:right w:w="100" w:type="dxa"/>
             </w:tcMar>
+            <w:vAlign w:val="center"/>
           </w:tcPr>
           <w:p>
             <w:pPr>
@@ -2075,27 +1984,14 @@
               <w:rPr>
                 <w:rFonts w:ascii="Times New Roman" w:hAnsi="Times New Roman" w:cs="Times New Roman"/>
               </w:rPr>
-              <w:t>- XDM 1.5km đường dây 35kV...</w:t>
-            </w:r>
-            <w:r>
-              <w:rPr>
-                <w:rFonts w:ascii="Times New Roman" w:hAnsi="Times New Roman" w:cs="Times New Roman"/>
-              </w:rPr>
-              <w:br/>
-              <w:t>- XDM 02 TBA (1x250 + 1x320)kVA-35/0.4kV.</w:t>
-            </w:r>
-            <w:r>
-              <w:rPr>
-                <w:rFonts w:ascii="Times New Roman" w:hAnsi="Times New Roman" w:cs="Times New Roman"/>
-              </w:rPr>
-              <w:br/>
-              <w:t>- Cải tạo 4.5km ĐZ 0.4kV.</w:t>
+              <w:t>{ct_quy_mo}</w:t>
             </w:r>
           </w:p>
         </w:tc>
         <w:tc>
           <w:tcPr>
             <w:tcW w:w="1048" w:type="pct"/>
+            <w:vAlign w:val="center"/>
           </w:tcPr>
           <w:p>
             <w:pPr>
@@ -2105,6 +2001,9 @@
                 <w:rFonts w:ascii="Times New Roman" w:hAnsi="Times New Roman" w:cs="Times New Roman"/>
               </w:rPr>
             </w:pPr>
+            <w:r>
+              <w:t>{ct_tmdt}</w:t>
+            </w:r>
           </w:p>
         </w:tc>
         <w:tc>
@@ -2116,6 +2015,7 @@
               <w:bottom w:w="100" w:type="dxa"/>
               <w:right w:w="100" w:type="dxa"/>
             </w:tcMar>
+            <w:vAlign w:val="center"/>
           </w:tcPr>
           <w:p>
             <w:pPr>
@@ -2129,7 +2029,7 @@
               <w:rPr>
                 <w:rFonts w:ascii="Times New Roman" w:hAnsi="Times New Roman" w:cs="Times New Roman"/>
               </w:rPr>
-              <w:t>15.500</w:t>
+              <w:t>{ct_khv}</w:t>
             </w:r>
           </w:p>
         </w:tc>
@@ -2142,6 +2042,7 @@
               <w:bottom w:w="100" w:type="dxa"/>
               <w:right w:w="100" w:type="dxa"/>
             </w:tcMar>
+            <w:vAlign w:val="center"/>
           </w:tcPr>
           <w:p>
             <w:pPr>
@@ -2155,7 +2056,7 @@
               <w:rPr>
                 <w:rFonts w:ascii="Times New Roman" w:hAnsi="Times New Roman" w:cs="Times New Roman"/>
               </w:rPr>
-              <w:t>2.480</w:t>
+              <w:t>{ct_tdtm}</w:t>
             </w:r>
           </w:p>
         </w:tc>
@@ -2168,6 +2069,7 @@
               <w:bottom w:w="100" w:type="dxa"/>
               <w:right w:w="100" w:type="dxa"/>
             </w:tcMar>
+            <w:vAlign w:val="center"/>
           </w:tcPr>
           <w:p>
             <w:pPr>
@@ -2181,7 +2083,7 @@
               <w:rPr>
                 <w:rFonts w:ascii="Times New Roman" w:hAnsi="Times New Roman" w:cs="Times New Roman"/>
               </w:rPr>
-              <w:t>1.860</w:t>
+              <w:t>{ct_khcb}</w:t>
             </w:r>
           </w:p>
         </w:tc>
@@ -2194,6 +2096,7 @@
               <w:bottom w:w="100" w:type="dxa"/>
               <w:right w:w="100" w:type="dxa"/>
             </w:tcMar>
+            <w:vAlign w:val="center"/>
           </w:tcPr>
           <w:p>
             <w:pPr>
@@ -2207,414 +2110,7 @@
               <w:rPr>
                 <w:rFonts w:ascii="Times New Roman" w:hAnsi="Times New Roman" w:cs="Times New Roman"/>
               </w:rPr>
-              <w:t>31/3/2027</w:t>
-            </w:r>
-          </w:p>
-        </w:tc>
-      </w:tr>
-      <w:tr>
-        <w:trPr>
-          <w:jc w:val="center"/>
-        </w:trPr>
-        <w:tc>
-          <w:tcPr>
-            <w:tcW w:w="242" w:type="pct"/>
-            <w:tcMar>
-              <w:top w:w="100" w:type="dxa"/>
-              <w:left w:w="100" w:type="dxa"/>
-              <w:bottom w:w="100" w:type="dxa"/>
-              <w:right w:w="100" w:type="dxa"/>
-            </w:tcMar>
-          </w:tcPr>
-          <w:p>
-            <w:pPr>
-              <w:spacing w:before="40" w:after="40"/>
-              <w:jc w:val="center"/>
-              <w:rPr>
-                <w:rFonts w:ascii="Times New Roman" w:hAnsi="Times New Roman" w:cs="Times New Roman"/>
-              </w:rPr>
-            </w:pPr>
-            <w:r>
-              <w:rPr>
-                <w:rFonts w:ascii="Times New Roman" w:hAnsi="Times New Roman" w:cs="Times New Roman"/>
-              </w:rPr>
-              <w:t>2</w:t>
-            </w:r>
-          </w:p>
-        </w:tc>
-        <w:tc>
-          <w:tcPr>
-            <w:tcW w:w="914" w:type="pct"/>
-            <w:tcMar>
-              <w:top w:w="100" w:type="dxa"/>
-              <w:left w:w="100" w:type="dxa"/>
-              <w:bottom w:w="100" w:type="dxa"/>
-              <w:right w:w="100" w:type="dxa"/>
-            </w:tcMar>
-          </w:tcPr>
-          <w:p>
-            <w:pPr>
-              <w:spacing w:before="40" w:after="40"/>
-              <w:rPr>
-                <w:rFonts w:ascii="Times New Roman" w:hAnsi="Times New Roman" w:cs="Times New Roman"/>
-              </w:rPr>
-            </w:pPr>
-            <w:r>
-              <w:rPr>
-                <w:rFonts w:ascii="Times New Roman" w:hAnsi="Times New Roman" w:cs="Times New Roman"/>
-              </w:rPr>
-              <w:t>Dự án mẫu 2: Sửa chữa cải tạo các MBA ngoài lưới năm 2026</w:t>
-            </w:r>
-          </w:p>
-        </w:tc>
-        <w:tc>
-          <w:tcPr>
-            <w:tcW w:w="1116" w:type="pct"/>
-            <w:tcMar>
-              <w:top w:w="100" w:type="dxa"/>
-              <w:left w:w="100" w:type="dxa"/>
-              <w:bottom w:w="100" w:type="dxa"/>
-              <w:right w:w="100" w:type="dxa"/>
-            </w:tcMar>
-          </w:tcPr>
-          <w:p>
-            <w:pPr>
-              <w:spacing w:before="40" w:after="40"/>
-              <w:rPr>
-                <w:rFonts w:ascii="Times New Roman" w:hAnsi="Times New Roman" w:cs="Times New Roman"/>
-              </w:rPr>
-            </w:pPr>
-            <w:r>
-              <w:rPr>
-                <w:rFonts w:ascii="Times New Roman" w:hAnsi="Times New Roman" w:cs="Times New Roman"/>
-              </w:rPr>
-              <w:t>- Sửa chữa, hiệu chỉnh 12 MBA cấp điện áp 35/0.4kV và 22/0.4kV phục vụ chống quá tải.</w:t>
-            </w:r>
-          </w:p>
-        </w:tc>
-        <w:tc>
-          <w:tcPr>
-            <w:tcW w:w="1048" w:type="pct"/>
-          </w:tcPr>
-          <w:p>
-            <w:pPr>
-              <w:spacing w:before="40" w:after="40"/>
-              <w:jc w:val="center"/>
-              <w:rPr>
-                <w:rFonts w:ascii="Times New Roman" w:hAnsi="Times New Roman" w:cs="Times New Roman"/>
-              </w:rPr>
-            </w:pPr>
-          </w:p>
-        </w:tc>
-        <w:tc>
-          <w:tcPr>
-            <w:tcW w:w="381" w:type="pct"/>
-            <w:tcMar>
-              <w:top w:w="100" w:type="dxa"/>
-              <w:left w:w="100" w:type="dxa"/>
-              <w:bottom w:w="100" w:type="dxa"/>
-              <w:right w:w="100" w:type="dxa"/>
-            </w:tcMar>
-          </w:tcPr>
-          <w:p>
-            <w:pPr>
-              <w:spacing w:before="40" w:after="40"/>
-              <w:jc w:val="center"/>
-              <w:rPr>
-                <w:rFonts w:ascii="Times New Roman" w:hAnsi="Times New Roman" w:cs="Times New Roman"/>
-              </w:rPr>
-            </w:pPr>
-            <w:r>
-              <w:rPr>
-                <w:rFonts w:ascii="Times New Roman" w:hAnsi="Times New Roman" w:cs="Times New Roman"/>
-              </w:rPr>
-              <w:t>3.200</w:t>
-            </w:r>
-          </w:p>
-        </w:tc>
-        <w:tc>
-          <w:tcPr>
-            <w:tcW w:w="396" w:type="pct"/>
-            <w:tcMar>
-              <w:top w:w="100" w:type="dxa"/>
-              <w:left w:w="100" w:type="dxa"/>
-              <w:bottom w:w="100" w:type="dxa"/>
-              <w:right w:w="100" w:type="dxa"/>
-            </w:tcMar>
-          </w:tcPr>
-          <w:p>
-            <w:pPr>
-              <w:spacing w:before="40" w:after="40"/>
-              <w:jc w:val="center"/>
-              <w:rPr>
-                <w:rFonts w:ascii="Times New Roman" w:hAnsi="Times New Roman" w:cs="Times New Roman"/>
-              </w:rPr>
-            </w:pPr>
-            <w:r>
-              <w:rPr>
-                <w:rFonts w:ascii="Times New Roman" w:hAnsi="Times New Roman" w:cs="Times New Roman"/>
-              </w:rPr>
-              <w:t>512</w:t>
-            </w:r>
-          </w:p>
-        </w:tc>
-        <w:tc>
-          <w:tcPr>
-            <w:tcW w:w="391" w:type="pct"/>
-            <w:tcMar>
-              <w:top w:w="100" w:type="dxa"/>
-              <w:left w:w="100" w:type="dxa"/>
-              <w:bottom w:w="100" w:type="dxa"/>
-              <w:right w:w="100" w:type="dxa"/>
-            </w:tcMar>
-          </w:tcPr>
-          <w:p>
-            <w:pPr>
-              <w:spacing w:before="40" w:after="40"/>
-              <w:jc w:val="center"/>
-              <w:rPr>
-                <w:rFonts w:ascii="Times New Roman" w:hAnsi="Times New Roman" w:cs="Times New Roman"/>
-              </w:rPr>
-            </w:pPr>
-            <w:r>
-              <w:rPr>
-                <w:rFonts w:ascii="Times New Roman" w:hAnsi="Times New Roman" w:cs="Times New Roman"/>
-              </w:rPr>
-              <w:t>384</w:t>
-            </w:r>
-          </w:p>
-        </w:tc>
-        <w:tc>
-          <w:tcPr>
-            <w:tcW w:w="511" w:type="pct"/>
-            <w:tcMar>
-              <w:top w:w="100" w:type="dxa"/>
-              <w:left w:w="100" w:type="dxa"/>
-              <w:bottom w:w="100" w:type="dxa"/>
-              <w:right w:w="100" w:type="dxa"/>
-            </w:tcMar>
-          </w:tcPr>
-          <w:p>
-            <w:pPr>
-              <w:spacing w:before="40" w:after="40"/>
-              <w:jc w:val="center"/>
-              <w:rPr>
-                <w:rFonts w:ascii="Times New Roman" w:hAnsi="Times New Roman" w:cs="Times New Roman"/>
-              </w:rPr>
-            </w:pPr>
-            <w:r>
-              <w:rPr>
-                <w:rFonts w:ascii="Times New Roman" w:hAnsi="Times New Roman" w:cs="Times New Roman"/>
-              </w:rPr>
-              <w:t>Quý I/2027</w:t>
-            </w:r>
-          </w:p>
-        </w:tc>
-      </w:tr>
-      <w:tr>
-        <w:trPr>
-          <w:jc w:val="center"/>
-        </w:trPr>
-        <w:tc>
-          <w:tcPr>
-            <w:tcW w:w="242" w:type="pct"/>
-            <w:tcMar>
-              <w:top w:w="100" w:type="dxa"/>
-              <w:left w:w="100" w:type="dxa"/>
-              <w:bottom w:w="100" w:type="dxa"/>
-              <w:right w:w="100" w:type="dxa"/>
-            </w:tcMar>
-          </w:tcPr>
-          <w:p>
-            <w:pPr>
-              <w:spacing w:before="40" w:after="40"/>
-              <w:jc w:val="center"/>
-              <w:rPr>
-                <w:rFonts w:ascii="Times New Roman" w:hAnsi="Times New Roman" w:cs="Times New Roman"/>
-              </w:rPr>
-            </w:pPr>
-            <w:r>
-              <w:rPr>
-                <w:rFonts w:ascii="Times New Roman" w:hAnsi="Times New Roman" w:cs="Times New Roman"/>
-                <w:i/>
-              </w:rPr>
-              <w:t>...</w:t>
-            </w:r>
-          </w:p>
-        </w:tc>
-        <w:tc>
-          <w:tcPr>
-            <w:tcW w:w="914" w:type="pct"/>
-            <w:tcMar>
-              <w:top w:w="100" w:type="dxa"/>
-              <w:left w:w="100" w:type="dxa"/>
-              <w:bottom w:w="100" w:type="dxa"/>
-              <w:right w:w="100" w:type="dxa"/>
-            </w:tcMar>
-          </w:tcPr>
-          <w:p>
-            <w:pPr>
-              <w:spacing w:before="40" w:after="40"/>
-              <w:rPr>
-                <w:rFonts w:ascii="Times New Roman" w:hAnsi="Times New Roman" w:cs="Times New Roman"/>
-              </w:rPr>
-            </w:pPr>
-            <w:r>
-              <w:rPr>
-                <w:rFonts w:ascii="Times New Roman" w:hAnsi="Times New Roman" w:cs="Times New Roman"/>
-                <w:i/>
-              </w:rPr>
-              <w:t/>
-            </w:r>
-          </w:p>
-        </w:tc>
-        <w:tc>
-          <w:tcPr>
-            <w:tcW w:w="1116" w:type="pct"/>
-            <w:tcMar>
-              <w:top w:w="100" w:type="dxa"/>
-              <w:left w:w="100" w:type="dxa"/>
-              <w:bottom w:w="100" w:type="dxa"/>
-              <w:right w:w="100" w:type="dxa"/>
-            </w:tcMar>
-          </w:tcPr>
-          <w:p>
-            <w:pPr>
-              <w:spacing w:before="40" w:after="40"/>
-              <w:jc w:val="center"/>
-              <w:rPr>
-                <w:rFonts w:ascii="Times New Roman" w:hAnsi="Times New Roman" w:cs="Times New Roman"/>
-              </w:rPr>
-            </w:pPr>
-            <w:r>
-              <w:rPr>
-                <w:rFonts w:ascii="Times New Roman" w:hAnsi="Times New Roman" w:cs="Times New Roman"/>
-                <w:i/>
-              </w:rPr>
-              <w:t>...</w:t>
-            </w:r>
-          </w:p>
-        </w:tc>
-        <w:tc>
-          <w:tcPr>
-            <w:tcW w:w="1048" w:type="pct"/>
-          </w:tcPr>
-          <w:p>
-            <w:pPr>
-              <w:spacing w:before="40" w:after="40"/>
-              <w:jc w:val="center"/>
-              <w:rPr>
-                <w:rFonts w:ascii="Times New Roman" w:hAnsi="Times New Roman" w:cs="Times New Roman"/>
-                <w:i/>
-              </w:rPr>
-            </w:pPr>
-          </w:p>
-        </w:tc>
-        <w:tc>
-          <w:tcPr>
-            <w:tcW w:w="381" w:type="pct"/>
-            <w:tcMar>
-              <w:top w:w="100" w:type="dxa"/>
-              <w:left w:w="100" w:type="dxa"/>
-              <w:bottom w:w="100" w:type="dxa"/>
-              <w:right w:w="100" w:type="dxa"/>
-            </w:tcMar>
-          </w:tcPr>
-          <w:p>
-            <w:pPr>
-              <w:spacing w:before="40" w:after="40"/>
-              <w:jc w:val="center"/>
-              <w:rPr>
-                <w:rFonts w:ascii="Times New Roman" w:hAnsi="Times New Roman" w:cs="Times New Roman"/>
-              </w:rPr>
-            </w:pPr>
-            <w:r>
-              <w:rPr>
-                <w:rFonts w:ascii="Times New Roman" w:hAnsi="Times New Roman" w:cs="Times New Roman"/>
-                <w:i/>
-              </w:rPr>
-              <w:t>...</w:t>
-            </w:r>
-          </w:p>
-        </w:tc>
-        <w:tc>
-          <w:tcPr>
-            <w:tcW w:w="396" w:type="pct"/>
-            <w:tcMar>
-              <w:top w:w="100" w:type="dxa"/>
-              <w:left w:w="100" w:type="dxa"/>
-              <w:bottom w:w="100" w:type="dxa"/>
-              <w:right w:w="100" w:type="dxa"/>
-            </w:tcMar>
-          </w:tcPr>
-          <w:p>
-            <w:pPr>
-              <w:spacing w:before="40" w:after="40"/>
-              <w:jc w:val="center"/>
-              <w:rPr>
-                <w:rFonts w:ascii="Times New Roman" w:hAnsi="Times New Roman" w:cs="Times New Roman"/>
-              </w:rPr>
-            </w:pPr>
-            <w:r>
-              <w:rPr>
-                <w:rFonts w:ascii="Times New Roman" w:hAnsi="Times New Roman" w:cs="Times New Roman"/>
-                <w:i/>
-              </w:rPr>
-              <w:t>...</w:t>
-            </w:r>
-          </w:p>
-        </w:tc>
-        <w:tc>
-          <w:tcPr>
-            <w:tcW w:w="391" w:type="pct"/>
-            <w:tcMar>
-              <w:top w:w="100" w:type="dxa"/>
-              <w:left w:w="100" w:type="dxa"/>
-              <w:bottom w:w="100" w:type="dxa"/>
-              <w:right w:w="100" w:type="dxa"/>
-            </w:tcMar>
-          </w:tcPr>
-          <w:p>
-            <w:pPr>
-              <w:spacing w:before="40" w:after="40"/>
-              <w:jc w:val="center"/>
-              <w:rPr>
-                <w:rFonts w:ascii="Times New Roman" w:hAnsi="Times New Roman" w:cs="Times New Roman"/>
-              </w:rPr>
-            </w:pPr>
-            <w:r>
-              <w:rPr>
-                <w:rFonts w:ascii="Times New Roman" w:hAnsi="Times New Roman" w:cs="Times New Roman"/>
-                <w:i/>
-              </w:rPr>
-              <w:t>...</w:t>
-            </w:r>
-          </w:p>
-        </w:tc>
-        <w:tc>
-          <w:tcPr>
-            <w:tcW w:w="511" w:type="pct"/>
-            <w:tcMar>
-              <w:top w:w="100" w:type="dxa"/>
-              <w:left w:w="100" w:type="dxa"/>
-              <w:bottom w:w="100" w:type="dxa"/>
-              <w:right w:w="100" w:type="dxa"/>
-            </w:tcMar>
-          </w:tcPr>
-          <w:p>
-            <w:pPr>
-              <w:spacing w:before="40" w:after="40"/>
-              <w:jc w:val="center"/>
-              <w:rPr>
-                <w:rFonts w:ascii="Times New Roman" w:hAnsi="Times New Roman" w:cs="Times New Roman"/>
-              </w:rPr>
-            </w:pPr>
-            <w:r>
-              <w:rPr>
-                <w:rFonts w:ascii="Times New Roman" w:hAnsi="Times New Roman" w:cs="Times New Roman"/>
-                <w:i/>
-              </w:rPr>
-              <w:t>...</w:t>
+              <w:t>{ct_tien_do}{/cong_trinh}</w:t>
             </w:r>
           </w:p>
         </w:tc>
@@ -2682,62 +2178,7 @@
 </w:document>
 </file>
 
-<file path=word\fontTable.xml><?xml version="1.0" encoding="utf-8"?>
-<w:fonts xmlns:mc="http://schemas.openxmlformats.org/markup-compatibility/2006" xmlns:r="http://schemas.openxmlformats.org/officeDocument/2006/relationships" xmlns:w="http://schemas.openxmlformats.org/wordprocessingml/2006/main" xmlns:w14="http://schemas.microsoft.com/office/word/2010/wordml" xmlns:w15="http://schemas.microsoft.com/office/word/2012/wordml" xmlns:w16cex="http://schemas.microsoft.com/office/word/2018/wordml/cex" xmlns:w16cid="http://schemas.microsoft.com/office/word/2016/wordml/cid" xmlns:w16="http://schemas.microsoft.com/office/word/2018/wordml" xmlns:w16du="http://schemas.microsoft.com/office/word/2023/wordml/word16du" xmlns:w16sdtdh="http://schemas.microsoft.com/office/word/2020/wordml/sdtdatahash" xmlns:w16sdtfl="http://schemas.microsoft.com/office/word/2024/wordml/sdtformatlock" xmlns:w16se="http://schemas.microsoft.com/office/word/2015/wordml/symex" mc:Ignorable="w14 w15 w16se w16cid w16 w16cex w16sdtdh w16sdtfl w16du">
-  <w:font w:name="Symbol">
-    <w:panose1 w:val="05050102010706020507"/>
-    <w:charset w:val="02"/>
-    <w:family w:val="roman"/>
-    <w:pitch w:val="variable"/>
-    <w:sig w:usb0="00000000" w:usb1="10000000" w:usb2="00000000" w:usb3="00000000" w:csb0="80000000" w:csb1="00000000"/>
-  </w:font>
-  <w:font w:name="Times New Roman">
-    <w:panose1 w:val="02020603050405020304"/>
-    <w:charset w:val="00"/>
-    <w:family w:val="roman"/>
-    <w:pitch w:val="variable"/>
-    <w:sig w:usb0="E0002EFF" w:usb1="C000785B" w:usb2="00000009" w:usb3="00000000" w:csb0="000001FF" w:csb1="00000000"/>
-  </w:font>
-  <w:font w:name="Cambria">
-    <w:panose1 w:val="02040503050406030204"/>
-    <w:charset w:val="00"/>
-    <w:family w:val="roman"/>
-    <w:pitch w:val="variable"/>
-    <w:sig w:usb0="E00006FF" w:usb1="420024FF" w:usb2="02000000" w:usb3="00000000" w:csb0="0000019F" w:csb1="00000000"/>
-  </w:font>
-  <w:font w:name="MS Mincho">
-    <w:panose1 w:val="02020609040205080304"/>
-    <w:charset w:val="80"/>
-    <w:family w:val="modern"/>
-    <w:pitch w:val="fixed"/>
-    <w:sig w:usb0="E00002FF" w:usb1="6AC7FDFB" w:usb2="08000012" w:usb3="00000000" w:csb0="0002009F" w:csb1="00000000"/>
-  </w:font>
-  <w:font w:name="Calibri">
-    <w:panose1 w:val="020F0502020204030204"/>
-    <w:charset w:val="00"/>
-    <w:family w:val="swiss"/>
-    <w:pitch w:val="variable"/>
-    <w:sig w:usb0="E4002EFF" w:usb1="C200247B" w:usb2="00000009" w:usb3="00000000" w:csb0="000001FF" w:csb1="00000000"/>
-  </w:font>
-  <w:font w:name="MS Gothic">
-    <w:altName w:val="ＭＳ ゴシック"/>
-    <w:panose1 w:val="020B0609070205080204"/>
-    <w:charset w:val="80"/>
-    <w:family w:val="modern"/>
-    <w:pitch w:val="fixed"/>
-    <w:sig w:usb0="E00002FF" w:usb1="6AC7FDFB" w:usb2="08000012" w:usb3="00000000" w:csb0="0002009F" w:csb1="00000000"/>
-  </w:font>
-  <w:font w:name="Courier">
-    <w:panose1 w:val="02070409020205020404"/>
-    <w:charset w:val="00"/>
-    <w:family w:val="auto"/>
-    <w:pitch w:val="variable"/>
-    <w:sig w:usb0="00000003" w:usb1="00000000" w:usb2="00000000" w:usb3="00000000" w:csb0="00000001" w:csb1="00000000"/>
-  </w:font>
-</w:fonts>
-</file>
-
-<file path=word\numbering.xml><?xml version="1.0" encoding="utf-8"?>
+<file path=word/numbering.xml><?xml version="1.0" encoding="utf-8"?>
 <w:numbering xmlns:wpc="http://schemas.microsoft.com/office/word/2010/wordprocessingCanvas" xmlns:cx="http://schemas.microsoft.com/office/drawing/2014/chartex" xmlns:cx1="http://schemas.microsoft.com/office/drawing/2015/9/8/chartex" xmlns:cx2="http://schemas.microsoft.com/office/drawing/2015/10/21/chartex" xmlns:cx3="http://schemas.microsoft.com/office/drawing/2016/5/9/chartex" xmlns:cx4="http://schemas.microsoft.com/office/drawing/2016/5/10/chartex" xmlns:cx5="http://schemas.microsoft.com/office/drawing/2016/5/11/chartex" xmlns:cx6="http://schemas.microsoft.com/office/drawing/2016/5/12/chartex" xmlns:cx7="http://schemas.microsoft.com/office/drawing/2016/5/13/chartex" xmlns:cx8="http://schemas.microsoft.com/office/drawing/2016/5/14/chartex" xmlns:mc="http://schemas.openxmlformats.org/markup-compatibility/2006" xmlns:aink="http://schemas.microsoft.com/office/drawing/2016/ink" xmlns:am3d="http://schemas.microsoft.com/office/drawing/2017/model3d" xmlns:o="urn:schemas-microsoft-com:office:office" xmlns:oel="http://schemas.microsoft.com/office/2019/extlst" xmlns:r="http://schemas.openxmlformats.org/officeDocument/2006/relationships" xmlns:m="http://schemas.openxmlformats.org/officeDocument/2006/math" xmlns:v="urn:schemas-microsoft-com:vml" xmlns:wp14="http://schemas.microsoft.com/office/word/2010/wordprocessingDrawing" xmlns:wp="http://schemas.openxmlformats.org/drawingml/2006/wordprocessingDrawing" xmlns:w10="urn:schemas-microsoft-com:office:word" xmlns:w="http://schemas.openxmlformats.org/wordprocessingml/2006/main" xmlns:w14="http://schemas.microsoft.com/office/word/2010/wordml" xmlns:w15="http://schemas.microsoft.com/office/word/2012/wordml" xmlns:w16cex="http://schemas.microsoft.com/office/word/2018/wordml/cex" xmlns:w16cid="http://schemas.microsoft.com/office/word/2016/wordml/cid" xmlns:w16="http://schemas.microsoft.com/office/word/2018/wordml" xmlns:w16du="http://schemas.microsoft.com/office/word/2023/wordml/word16du" xmlns:w16sdtdh="http://schemas.microsoft.com/office/word/2020/wordml/sdtdatahash" xmlns:w16sdtfl="http://schemas.microsoft.com/office/word/2024/wordml/sdtformatlock" xmlns:w16se="http://schemas.microsoft.com/office/word/2015/wordml/symex" xmlns:wpg="http://schemas.microsoft.com/office/word/2010/wordprocessingGroup" xmlns:wpi="http://schemas.microsoft.com/office/word/2010/wordprocessingInk" xmlns:wne="http://schemas.microsoft.com/office/word/2006/wordml" xmlns:wps="http://schemas.microsoft.com/office/word/2010/wordprocessingShape" mc:Ignorable="w14 w15 w16se w16cid w16 w16cex w16sdtdh w16sdtfl w16du wp14">
   <w:abstractNum w:abstractNumId="0" w15:restartNumberingAfterBreak="0">
     <w:nsid w:val="FFFFFF7C"/>
@@ -2940,68 +2381,7 @@
 </w:numbering>
 </file>
 
-<file path=word\settings.xml><?xml version="1.0" encoding="utf-8"?>
-<w:settings xmlns:mc="http://schemas.openxmlformats.org/markup-compatibility/2006" xmlns:o="urn:schemas-microsoft-com:office:office" xmlns:r="http://schemas.openxmlformats.org/officeDocument/2006/relationships" xmlns:m="http://schemas.openxmlformats.org/officeDocument/2006/math" xmlns:v="urn:schemas-microsoft-com:vml" xmlns:w10="urn:schemas-microsoft-com:office:word" xmlns:w="http://schemas.openxmlformats.org/wordprocessingml/2006/main" xmlns:w14="http://schemas.microsoft.com/office/word/2010/wordml" xmlns:w15="http://schemas.microsoft.com/office/word/2012/wordml" xmlns:w16cex="http://schemas.microsoft.com/office/word/2018/wordml/cex" xmlns:w16cid="http://schemas.microsoft.com/office/word/2016/wordml/cid" xmlns:w16="http://schemas.microsoft.com/office/word/2018/wordml" xmlns:w16du="http://schemas.microsoft.com/office/word/2023/wordml/word16du" xmlns:w16sdtdh="http://schemas.microsoft.com/office/word/2020/wordml/sdtdatahash" xmlns:w16sdtfl="http://schemas.microsoft.com/office/word/2024/wordml/sdtformatlock" xmlns:w16se="http://schemas.microsoft.com/office/word/2015/wordml/symex" xmlns:sl="http://schemas.openxmlformats.org/schemaLibrary/2006/main" mc:Ignorable="w14 w15 w16se w16cid w16 w16cex w16sdtdh w16sdtfl w16du">
-  <w:zoom w:percent="100"/>
-  <w:defaultTabStop w:val="720"/>
-  <w:characterSpacingControl w:val="doNotCompress"/>
-  <w:compat>
-    <w:useFELayout/>
-    <w:compatSetting w:name="compatibilityMode" w:uri="http://schemas.microsoft.com/office/word" w:val="14"/>
-    <w:compatSetting w:name="overrideTableStyleFontSizeAndJustification" w:uri="http://schemas.microsoft.com/office/word" w:val="1"/>
-    <w:compatSetting w:name="enableOpenTypeFeatures" w:uri="http://schemas.microsoft.com/office/word" w:val="1"/>
-    <w:compatSetting w:name="doNotFlipMirrorIndents" w:uri="http://schemas.microsoft.com/office/word" w:val="1"/>
-    <w:compatSetting w:name="useWord2013TrackBottomHyphenation" w:uri="http://schemas.microsoft.com/office/word" w:val="1"/>
-  </w:compat>
-  <w:rsids>
-    <w:rsidRoot w:val="00B47730"/>
-    <w:rsid w:val="00034616"/>
-    <w:rsid w:val="0006063C"/>
-    <w:rsid w:val="0015074B"/>
-    <w:rsid w:val="001E0EED"/>
-    <w:rsid w:val="0029639D"/>
-    <w:rsid w:val="00326F90"/>
-    <w:rsid w:val="00661875"/>
-    <w:rsid w:val="009A2188"/>
-    <w:rsid w:val="00AA1D8D"/>
-    <w:rsid w:val="00B47730"/>
-    <w:rsid w:val="00C6096D"/>
-    <w:rsid w:val="00CB0664"/>
-    <w:rsid w:val="00E735EC"/>
-    <w:rsid w:val="00F84413"/>
-    <w:rsid w:val="00FC693F"/>
-  </w:rsids>
-  <m:mathPr>
-    <m:mathFont m:val="Cambria Math"/>
-    <m:brkBin m:val="before"/>
-    <m:brkBinSub m:val="--"/>
-    <m:smallFrac m:val="0"/>
-    <m:dispDef/>
-    <m:lMargin m:val="0"/>
-    <m:rMargin m:val="0"/>
-    <m:defJc m:val="centerGroup"/>
-    <m:wrapIndent m:val="1440"/>
-    <m:intLim m:val="subSup"/>
-    <m:naryLim m:val="undOvr"/>
-  </m:mathPr>
-  <w:themeFontLang w:val="en-US" w:eastAsia="ja-JP"/>
-  <w:clrSchemeMapping w:bg1="light1" w:t1="dark1" w:bg2="light2" w:t2="dark2" w:accent1="accent1" w:accent2="accent2" w:accent3="accent3" w:accent4="accent4" w:accent5="accent5" w:accent6="accent6" w:hyperlink="hyperlink" w:followedHyperlink="followedHyperlink"/>
-  <w:doNotAutoCompressPictures/>
-  <w:shapeDefaults>
-    <o:shapedefaults v:ext="edit" spidmax="1026"/>
-    <o:shapelayout v:ext="edit">
-      <o:idmap v:ext="edit" data="1"/>
-    </o:shapelayout>
-  </w:shapeDefaults>
-  <w:decimalSymbol w:val="."/>
-  <w:listSeparator w:val=","/>
-  <w14:docId w14:val="7A2DA5BC"/>
-  <w14:defaultImageDpi w14:val="300"/>
-  <w15:docId w15:val="{12388355-C3A8-45F8-AC78-4727EBD4DB7C}"/>
-</w:settings>
-</file>
-
-<file path=word\styles.xml><?xml version="1.0" encoding="utf-8"?>
+<file path=word/styles.xml><?xml version="1.0" encoding="utf-8"?>
 <w:styles xmlns:mc="http://schemas.openxmlformats.org/markup-compatibility/2006" xmlns:r="http://schemas.openxmlformats.org/officeDocument/2006/relationships" xmlns:w="http://schemas.openxmlformats.org/wordprocessingml/2006/main" xmlns:w14="http://schemas.microsoft.com/office/word/2010/wordml" xmlns:w15="http://schemas.microsoft.com/office/word/2012/wordml" xmlns:w16cex="http://schemas.microsoft.com/office/word/2018/wordml/cex" xmlns:w16cid="http://schemas.microsoft.com/office/word/2016/wordml/cid" xmlns:w16="http://schemas.microsoft.com/office/word/2018/wordml" xmlns:w16du="http://schemas.microsoft.com/office/word/2023/wordml/word16du" xmlns:w16sdtdh="http://schemas.microsoft.com/office/word/2020/wordml/sdtdatahash" xmlns:w16sdtfl="http://schemas.microsoft.com/office/word/2024/wordml/sdtformatlock" xmlns:w16se="http://schemas.microsoft.com/office/word/2015/wordml/symex" mc:Ignorable="w14 w15 w16se w16cid w16 w16cex w16sdtdh w16sdtfl w16du">
   <w:docDefaults>
     <w:rPrDefault>
@@ -14384,7 +13764,7 @@
 </w:styles>
 </file>
 
-<file path=word\theme\theme1.xml><?xml version="1.0" encoding="utf-8"?>
+<file path=word/theme/theme1.xml><?xml version="1.0" encoding="utf-8"?>
 <a:theme xmlns:a="http://schemas.openxmlformats.org/drawingml/2006/main" name="Office Theme">
   <a:themeElements>
     <a:clrScheme name="Office">
@@ -14704,8 +14084,14 @@
 </a:theme>
 </file>
 
-<file path=word\webSettings.xml><?xml version="1.0" encoding="utf-8"?>
-<w:webSettings xmlns:mc="http://schemas.openxmlformats.org/markup-compatibility/2006" xmlns:r="http://schemas.openxmlformats.org/officeDocument/2006/relationships" xmlns:w="http://schemas.openxmlformats.org/wordprocessingml/2006/main" xmlns:w14="http://schemas.microsoft.com/office/word/2010/wordml" xmlns:w15="http://schemas.microsoft.com/office/word/2012/wordml" xmlns:w16cex="http://schemas.microsoft.com/office/word/2018/wordml/cex" xmlns:w16cid="http://schemas.microsoft.com/office/word/2016/wordml/cid" xmlns:w16="http://schemas.microsoft.com/office/word/2018/wordml" xmlns:w16du="http://schemas.microsoft.com/office/word/2023/wordml/word16du" xmlns:w16sdtdh="http://schemas.microsoft.com/office/word/2020/wordml/sdtdatahash" xmlns:w16sdtfl="http://schemas.microsoft.com/office/word/2024/wordml/sdtformatlock" xmlns:w16se="http://schemas.microsoft.com/office/word/2015/wordml/symex" mc:Ignorable="w14 w15 w16se w16cid w16 w16cex w16sdtdh w16sdtfl w16du">
-  <w:allowPNG/>
-</w:webSettings>
+<file path=customXml/item1.xml><?xml version="1.0" encoding="utf-8"?>
+<b:Sources xmlns:b="http://schemas.openxmlformats.org/officeDocument/2006/bibliography" xmlns="http://schemas.openxmlformats.org/officeDocument/2006/bibliography" SelectedStyle="/APA.XSL" StyleName="APA"/>
+</file>
+
+<file path=customXml/itemProps1.xml><?xml version="1.0" encoding="utf-8"?>
+<ds:datastoreItem xmlns:ds="http://schemas.openxmlformats.org/officeDocument/2006/customXml" ds:itemID="{EF278816-EC6F-A645-907D-7F25AECB1D4A}">
+  <ds:schemaRefs>
+    <ds:schemaRef ds:uri="http://schemas.openxmlformats.org/officeDocument/2006/bibliography"/>
+  </ds:schemaRefs>
+</ds:datastoreItem>
 </file>
</xml_diff>

<commit_message>
Đóng phiên: TVGS GHĐ 1% không tạm ứng, số đồng, mẫu Word và tên tệp GNV (v0.1.5).
Co-authored-by: Cursor <cursoragent@cursor.com>
</commit_message>
<xml_diff>
--- a/public/templates/qd-giao-nhiem-vu-tnhc.docx
+++ b/public/templates/qd-giao-nhiem-vu-tnhc.docx
@@ -1,6 +1,6 @@
 
 <file path=word/document.xml><?xml version="1.0" encoding="utf-8"?>
-<w:document xmlns:wpc="http://schemas.microsoft.com/office/word/2010/wordprocessingCanvas" xmlns:cx="http://schemas.microsoft.com/office/drawing/2014/chartex" xmlns:cx1="http://schemas.microsoft.com/office/drawing/2015/9/8/chartex" xmlns:cx2="http://schemas.microsoft.com/office/drawing/2015/10/21/chartex" xmlns:cx3="http://schemas.microsoft.com/office/drawing/2016/5/9/chartex" xmlns:cx4="http://schemas.microsoft.com/office/drawing/2016/5/10/chartex" xmlns:cx5="http://schemas.microsoft.com/office/drawing/2016/5/11/chartex" xmlns:cx6="http://schemas.microsoft.com/office/drawing/2016/5/12/chartex" xmlns:cx7="http://schemas.microsoft.com/office/drawing/2016/5/13/chartex" xmlns:cx8="http://schemas.microsoft.com/office/drawing/2016/5/14/chartex" xmlns:mc="http://schemas.openxmlformats.org/markup-compatibility/2006" xmlns:aink="http://schemas.microsoft.com/office/drawing/2016/ink" xmlns:am3d="http://schemas.microsoft.com/office/drawing/2017/model3d" xmlns:o="urn:schemas-microsoft-com:office:office" xmlns:oel="http://schemas.microsoft.com/office/2019/extlst" xmlns:r="http://schemas.openxmlformats.org/officeDocument/2006/relationships" xmlns:m="http://schemas.openxmlformats.org/officeDocument/2006/math" xmlns:v="urn:schemas-microsoft-com:vml" xmlns:wp14="http://schemas.microsoft.com/office/word/2010/wordprocessingDrawing" xmlns:wp="http://schemas.openxmlformats.org/drawingml/2006/wordprocessingDrawing" xmlns:w10="urn:schemas-microsoft-com:office:word" xmlns:w="http://schemas.openxmlformats.org/wordprocessingml/2006/main" xmlns:w14="http://schemas.microsoft.com/office/word/2010/wordml" xmlns:w15="http://schemas.microsoft.com/office/word/2012/wordml" xmlns:w16cex="http://schemas.microsoft.com/office/word/2018/wordml/cex" xmlns:w16cid="http://schemas.microsoft.com/office/word/2016/wordml/cid" xmlns:w16="http://schemas.microsoft.com/office/word/2018/wordml" xmlns:w16du="http://schemas.microsoft.com/office/word/2023/wordml/word16du" xmlns:w16sdtdh="http://schemas.microsoft.com/office/word/2020/wordml/sdtdatahash" xmlns:w16sdtfl="http://schemas.microsoft.com/office/word/2024/wordml/sdtformatlock" xmlns:w16se="http://schemas.microsoft.com/office/word/2015/wordml/symex" xmlns:wpg="http://schemas.microsoft.com/office/word/2010/wordprocessingGroup" xmlns:wpi="http://schemas.microsoft.com/office/word/2010/wordprocessingInk" xmlns:wne="http://schemas.microsoft.com/office/word/2006/wordml" xmlns:wps="http://schemas.microsoft.com/office/word/2010/wordprocessingShape" mc:Ignorable="w14 w15 w16se w16cid w16 w16cex w16sdtdh w16sdtfl w16du wp14">
+<w:document xmlns:wpc="http://schemas.microsoft.com/office/word/2010/wordprocessingCanvas" xmlns:cx="http://schemas.microsoft.com/office/drawing/2014/chartex" xmlns:cx1="http://schemas.microsoft.com/office/drawing/2015/9/8/chartex" xmlns:cx2="http://schemas.microsoft.com/office/drawing/2015/10/21/chartex" xmlns:cx3="http://schemas.microsoft.com/office/drawing/2016/5/9/chartex" xmlns:cx4="http://schemas.microsoft.com/office/drawing/2016/5/10/chartex" xmlns:cx5="http://schemas.microsoft.com/office/drawing/2016/5/11/chartex" xmlns:cx6="http://schemas.microsoft.com/office/drawing/2016/5/12/chartex" xmlns:cx7="http://schemas.microsoft.com/office/drawing/2016/5/13/chartex" xmlns:cx8="http://schemas.microsoft.com/office/drawing/2016/5/14/chartex" xmlns:mc="http://schemas.openxmlformats.org/markup-compatibility/2006" xmlns:aink="http://schemas.microsoft.com/office/drawing/2016/ink" xmlns:am3d="http://schemas.microsoft.com/office/drawing/2017/model3d" xmlns:o="urn:schemas-microsoft-com:office:office" xmlns:oel="http://schemas.microsoft.com/office/2019/extlst" xmlns:r="http://schemas.openxmlformats.org/officeDocument/2006/relationships" xmlns:m="http://schemas.openxmlformats.org/officeDocument/2006/math" xmlns:v="urn:schemas-microsoft-com:vml" xmlns:wp14="http://schemas.microsoft.com/office/word/2010/wordprocessingDrawing" xmlns:wp="http://schemas.openxmlformats.org/drawingml/2006/wordprocessingDrawing" xmlns:w10="urn:schemas-microsoft-com:office:word" xmlns:w="http://schemas.openxmlformats.org/wordprocessingml/2006/main" xmlns:w14="http://schemas.microsoft.com/office/word/2010/wordml" xmlns:w15="http://schemas.microsoft.com/office/word/2012/wordml" xmlns:w16cei="http://schemas.microsoft.com/office/word/2026/wordml/cei" xmlns:w16cex="http://schemas.microsoft.com/office/word/2018/wordml/cex" xmlns:w16cid="http://schemas.microsoft.com/office/word/2016/wordml/cid" xmlns:w16="http://schemas.microsoft.com/office/word/2018/wordml" xmlns:w16du="http://schemas.microsoft.com/office/word/2023/wordml/word16du" xmlns:w16sdtdh="http://schemas.microsoft.com/office/word/2020/wordml/sdtdatahash" xmlns:w16sdtfl="http://schemas.microsoft.com/office/word/2024/wordml/sdtformatlock" xmlns:w16se="http://schemas.microsoft.com/office/word/2015/wordml/symex" xmlns:wpg="http://schemas.microsoft.com/office/word/2010/wordprocessingGroup" xmlns:wpi="http://schemas.microsoft.com/office/word/2010/wordprocessingInk" xmlns:wne="http://schemas.microsoft.com/office/word/2006/wordml" xmlns:wps="http://schemas.microsoft.com/office/word/2010/wordprocessingShape" mc:Ignorable="w14 w15 w16se w16cid w16 w16cex w16sdtdh w16sdtfl w16du wp14">
   <w:body>
     <w:tbl>
       <w:tblPr>
@@ -129,7 +129,7 @@
                 </mc:Choice>
                 <mc:Fallback>
                   <w:pict>
-                    <v:line w14:anchorId="76E4D3AA" id="Straight Connector 1" o:spid="_x0000_s1026" style="position:absolute;z-index:251657216;visibility:visible;mso-wrap-style:square;mso-wrap-distance-left:9pt;mso-wrap-distance-top:0;mso-wrap-distance-right:9pt;mso-wrap-distance-bottom:0;mso-position-horizontal:absolute;mso-position-horizontal-relative:margin;mso-position-vertical:absolute;mso-position-vertical-relative:text" from="41.45pt,14.15pt" to="147.2pt,14.15pt" o:gfxdata="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" strokecolor="black [3040]" strokeweight=".5pt">
+                    <v:line w14:anchorId="53332AAC" id="Straight Connector 1" o:spid="_x0000_s1026" style="position:absolute;z-index:251657216;visibility:visible;mso-wrap-style:square;mso-wrap-distance-left:9pt;mso-wrap-distance-top:0;mso-wrap-distance-right:9pt;mso-wrap-distance-bottom:0;mso-position-horizontal:absolute;mso-position-horizontal-relative:margin;mso-position-vertical:absolute;mso-position-vertical-relative:text" from="41.45pt,14.15pt" to="147.2pt,14.15pt" o:gfxdata="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" strokecolor="black [3040]" strokeweight=".5pt">
                       <w10:wrap anchorx="margin"/>
                     </v:line>
                   </w:pict>
@@ -280,7 +280,7 @@
                 </mc:Choice>
                 <mc:Fallback>
                   <w:pict>
-                    <v:line w14:anchorId="5CB29A88" id="Straight Connector 2" o:spid="_x0000_s1026" style="position:absolute;z-index:251660288;visibility:visible;mso-wrap-style:square;mso-width-percent:0;mso-wrap-distance-left:9pt;mso-wrap-distance-top:0;mso-wrap-distance-right:9pt;mso-wrap-distance-bottom:0;mso-position-horizontal:absolute;mso-position-horizontal-relative:margin;mso-position-vertical:absolute;mso-position-vertical-relative:text;mso-width-percent:0;mso-width-relative:margin" from="56.85pt,15.3pt" to="190.75pt,15.3pt" o:gfxdata="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" strokecolor="black [3040]" strokeweight=".5pt">
+                    <v:line w14:anchorId="23BDD37E" id="Straight Connector 2" o:spid="_x0000_s1026" style="position:absolute;z-index:251660288;visibility:visible;mso-wrap-style:square;mso-width-percent:0;mso-wrap-distance-left:9pt;mso-wrap-distance-top:0;mso-wrap-distance-right:9pt;mso-wrap-distance-bottom:0;mso-position-horizontal:absolute;mso-position-horizontal-relative:margin;mso-position-vertical:absolute;mso-position-vertical-relative:text;mso-width-percent:0;mso-width-relative:margin" from="56.85pt,15.3pt" to="190.75pt,15.3pt" o:gfxdata="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" strokecolor="black [3040]" strokeweight=".5pt">
                       <w10:wrap anchorx="margin"/>
                     </v:line>
                   </w:pict>
@@ -355,7 +355,7 @@
           <w:b/>
           <w:sz w:val="24"/>
         </w:rPr>
-        <w:t xml:space="preserve">Về việc giao nhiệm vụ cho Xí nghiệp Dịch vụ Điện lực </w:t>
+        <w:t xml:space="preserve">Về việc giao nhiệm vụ cho </w:t>
       </w:r>
       <w:r>
         <w:rPr>
@@ -416,7 +416,7 @@
           <w:b/>
           <w:sz w:val="24"/>
         </w:rPr>
-        <w:t xml:space="preserve">cho Công ty Điện lực </w:t>
+        <w:t xml:space="preserve">cho </w:t>
       </w:r>
       <w:r>
         <w:rPr>
@@ -560,7 +560,7 @@
           <w:sz w:val="26"/>
           <w:szCs w:val="26"/>
         </w:rPr>
-        <w:t xml:space="preserve">của Tổng công ty Điện lực miền Bắc về việc thành lập Xí nghiệp Dịch vụ Điện lực </w:t>
+        <w:t xml:space="preserve">của Tổng công ty Điện lực miền Bắc về việc thành lập </w:t>
       </w:r>
       <w:r>
         <w:rPr>
@@ -658,7 +658,7 @@
           <w:sz w:val="26"/>
           <w:szCs w:val="26"/>
         </w:rPr>
-        <w:t xml:space="preserve">năm {nam_ke_hoach} cho Công ty Điện lực </w:t>
+        <w:t xml:space="preserve">năm {nam_ke_hoach} cho </w:t>
       </w:r>
       <w:r>
         <w:rPr>
@@ -744,7 +744,10 @@
     <w:p>
       <w:pPr>
         <w:spacing w:after="120"/>
+        <w:jc w:val="center"/>
         <w:rPr>
+          <w:i/>
+          <w:iCs/>
           <w:sz w:val="26"/>
           <w:szCs w:val="26"/>
         </w:rPr>
@@ -765,7 +768,7 @@
           <w:sz w:val="26"/>
           <w:szCs w:val="26"/>
         </w:rPr>
-        <w:t xml:space="preserve"> Giao nhiệm vụ cho Xí nghiệp Dịch vụ Điện lực </w:t>
+        <w:t xml:space="preserve"> Giao nhiệm vụ cho </w:t>
       </w:r>
       <w:r>
         <w:rPr>
@@ -816,7 +819,7 @@
           <w:sz w:val="26"/>
           <w:szCs w:val="26"/>
         </w:rPr>
-        <w:t xml:space="preserve"> cho Công ty Điện lực </w:t>
+        <w:t xml:space="preserve"> cho </w:t>
       </w:r>
       <w:r>
         <w:rPr>
@@ -842,6 +845,15 @@
           <w:szCs w:val="26"/>
         </w:rPr>
         <w:br/>
+      </w:r>
+      <w:r>
+        <w:rPr>
+          <w:rFonts w:ascii="Times New Roman" w:hAnsi="Times New Roman"/>
+          <w:i/>
+          <w:iCs/>
+          <w:sz w:val="26"/>
+          <w:szCs w:val="26"/>
+        </w:rPr>
         <w:t>(Chi tiết danh mục công trình tại Phụ lục đính kèm).</w:t>
       </w:r>
     </w:p>
@@ -875,7 +887,6 @@
     <w:p>
       <w:pPr>
         <w:spacing w:after="120"/>
-        <w:ind w:left="360"/>
         <w:jc w:val="both"/>
         <w:rPr>
           <w:sz w:val="26"/>
@@ -912,7 +923,6 @@
     <w:p>
       <w:pPr>
         <w:spacing w:after="120"/>
-        <w:ind w:left="360"/>
         <w:jc w:val="both"/>
         <w:rPr>
           <w:sz w:val="26"/>
@@ -1245,7 +1255,25 @@
           <w:color w:val="EE0000"/>
           <w:sz w:val="26"/>
         </w:rPr>
-        <w:t xml:space="preserve"> – CÔNG TY ĐIỆN LỰC TỈNH {ten_pc_tinh}</w:t>
+        <w:t xml:space="preserve"> –</w:t>
+      </w:r>
+      <w:r>
+        <w:rPr>
+          <w:rFonts w:ascii="Times New Roman" w:hAnsi="Times New Roman"/>
+          <w:b/>
+          <w:color w:val="EE0000"/>
+          <w:sz w:val="26"/>
+        </w:rPr>
+        <w:t xml:space="preserve"> </w:t>
+      </w:r>
+      <w:r>
+        <w:rPr>
+          <w:rFonts w:ascii="Times New Roman" w:hAnsi="Times New Roman"/>
+          <w:b/>
+          <w:color w:val="EE0000"/>
+          <w:sz w:val="26"/>
+        </w:rPr>
+        <w:t>{ten_pc_tinh}</w:t>
       </w:r>
     </w:p>
     <w:p>
@@ -1293,8 +1321,8 @@
       <w:tblGrid>
         <w:gridCol w:w="1894"/>
         <w:gridCol w:w="1145"/>
-        <w:gridCol w:w="2400"/>
-        <w:gridCol w:w="700"/>
+        <w:gridCol w:w="1659"/>
+        <w:gridCol w:w="1486"/>
         <w:gridCol w:w="1254"/>
         <w:gridCol w:w="1352"/>
         <w:gridCol w:w="1364"/>
@@ -1479,7 +1507,15 @@
                 <w:b/>
                 <w:color w:val="EE0000"/>
               </w:rPr>
-              <w:t>Giá trị KHV năm 2026</w:t>
+              <w:t xml:space="preserve">Giá trị KHV </w:t>
+            </w:r>
+            <w:r>
+              <w:rPr>
+                <w:rFonts w:ascii="Times New Roman" w:hAnsi="Times New Roman" w:cs="Times New Roman"/>
+                <w:b/>
+                <w:color w:val="EE0000"/>
+              </w:rPr>
+              <w:t>{nam_ke_hoach}</w:t>
             </w:r>
           </w:p>
           <w:p>
@@ -2179,7 +2215,7 @@
 </file>
 
 <file path=word/numbering.xml><?xml version="1.0" encoding="utf-8"?>
-<w:numbering xmlns:wpc="http://schemas.microsoft.com/office/word/2010/wordprocessingCanvas" xmlns:cx="http://schemas.microsoft.com/office/drawing/2014/chartex" xmlns:cx1="http://schemas.microsoft.com/office/drawing/2015/9/8/chartex" xmlns:cx2="http://schemas.microsoft.com/office/drawing/2015/10/21/chartex" xmlns:cx3="http://schemas.microsoft.com/office/drawing/2016/5/9/chartex" xmlns:cx4="http://schemas.microsoft.com/office/drawing/2016/5/10/chartex" xmlns:cx5="http://schemas.microsoft.com/office/drawing/2016/5/11/chartex" xmlns:cx6="http://schemas.microsoft.com/office/drawing/2016/5/12/chartex" xmlns:cx7="http://schemas.microsoft.com/office/drawing/2016/5/13/chartex" xmlns:cx8="http://schemas.microsoft.com/office/drawing/2016/5/14/chartex" xmlns:mc="http://schemas.openxmlformats.org/markup-compatibility/2006" xmlns:aink="http://schemas.microsoft.com/office/drawing/2016/ink" xmlns:am3d="http://schemas.microsoft.com/office/drawing/2017/model3d" xmlns:o="urn:schemas-microsoft-com:office:office" xmlns:oel="http://schemas.microsoft.com/office/2019/extlst" xmlns:r="http://schemas.openxmlformats.org/officeDocument/2006/relationships" xmlns:m="http://schemas.openxmlformats.org/officeDocument/2006/math" xmlns:v="urn:schemas-microsoft-com:vml" xmlns:wp14="http://schemas.microsoft.com/office/word/2010/wordprocessingDrawing" xmlns:wp="http://schemas.openxmlformats.org/drawingml/2006/wordprocessingDrawing" xmlns:w10="urn:schemas-microsoft-com:office:word" xmlns:w="http://schemas.openxmlformats.org/wordprocessingml/2006/main" xmlns:w14="http://schemas.microsoft.com/office/word/2010/wordml" xmlns:w15="http://schemas.microsoft.com/office/word/2012/wordml" xmlns:w16cex="http://schemas.microsoft.com/office/word/2018/wordml/cex" xmlns:w16cid="http://schemas.microsoft.com/office/word/2016/wordml/cid" xmlns:w16="http://schemas.microsoft.com/office/word/2018/wordml" xmlns:w16du="http://schemas.microsoft.com/office/word/2023/wordml/word16du" xmlns:w16sdtdh="http://schemas.microsoft.com/office/word/2020/wordml/sdtdatahash" xmlns:w16sdtfl="http://schemas.microsoft.com/office/word/2024/wordml/sdtformatlock" xmlns:w16se="http://schemas.microsoft.com/office/word/2015/wordml/symex" xmlns:wpg="http://schemas.microsoft.com/office/word/2010/wordprocessingGroup" xmlns:wpi="http://schemas.microsoft.com/office/word/2010/wordprocessingInk" xmlns:wne="http://schemas.microsoft.com/office/word/2006/wordml" xmlns:wps="http://schemas.microsoft.com/office/word/2010/wordprocessingShape" mc:Ignorable="w14 w15 w16se w16cid w16 w16cex w16sdtdh w16sdtfl w16du wp14">
+<w:numbering xmlns:wpc="http://schemas.microsoft.com/office/word/2010/wordprocessingCanvas" xmlns:cx="http://schemas.microsoft.com/office/drawing/2014/chartex" xmlns:cx1="http://schemas.microsoft.com/office/drawing/2015/9/8/chartex" xmlns:cx2="http://schemas.microsoft.com/office/drawing/2015/10/21/chartex" xmlns:cx3="http://schemas.microsoft.com/office/drawing/2016/5/9/chartex" xmlns:cx4="http://schemas.microsoft.com/office/drawing/2016/5/10/chartex" xmlns:cx5="http://schemas.microsoft.com/office/drawing/2016/5/11/chartex" xmlns:cx6="http://schemas.microsoft.com/office/drawing/2016/5/12/chartex" xmlns:cx7="http://schemas.microsoft.com/office/drawing/2016/5/13/chartex" xmlns:cx8="http://schemas.microsoft.com/office/drawing/2016/5/14/chartex" xmlns:mc="http://schemas.openxmlformats.org/markup-compatibility/2006" xmlns:aink="http://schemas.microsoft.com/office/drawing/2016/ink" xmlns:am3d="http://schemas.microsoft.com/office/drawing/2017/model3d" xmlns:o="urn:schemas-microsoft-com:office:office" xmlns:oel="http://schemas.microsoft.com/office/2019/extlst" xmlns:r="http://schemas.openxmlformats.org/officeDocument/2006/relationships" xmlns:m="http://schemas.openxmlformats.org/officeDocument/2006/math" xmlns:v="urn:schemas-microsoft-com:vml" xmlns:wp14="http://schemas.microsoft.com/office/word/2010/wordprocessingDrawing" xmlns:wp="http://schemas.openxmlformats.org/drawingml/2006/wordprocessingDrawing" xmlns:w10="urn:schemas-microsoft-com:office:word" xmlns:w="http://schemas.openxmlformats.org/wordprocessingml/2006/main" xmlns:w14="http://schemas.microsoft.com/office/word/2010/wordml" xmlns:w15="http://schemas.microsoft.com/office/word/2012/wordml" xmlns:w16cei="http://schemas.microsoft.com/office/word/2026/wordml/cei" xmlns:w16cex="http://schemas.microsoft.com/office/word/2018/wordml/cex" xmlns:w16cid="http://schemas.microsoft.com/office/word/2016/wordml/cid" xmlns:w16="http://schemas.microsoft.com/office/word/2018/wordml" xmlns:w16du="http://schemas.microsoft.com/office/word/2023/wordml/word16du" xmlns:w16sdtdh="http://schemas.microsoft.com/office/word/2020/wordml/sdtdatahash" xmlns:w16sdtfl="http://schemas.microsoft.com/office/word/2024/wordml/sdtformatlock" xmlns:w16se="http://schemas.microsoft.com/office/word/2015/wordml/symex" xmlns:wpg="http://schemas.microsoft.com/office/word/2010/wordprocessingGroup" xmlns:wpi="http://schemas.microsoft.com/office/word/2010/wordprocessingInk" xmlns:wne="http://schemas.microsoft.com/office/word/2006/wordml" xmlns:wps="http://schemas.microsoft.com/office/word/2010/wordprocessingShape" mc:Ignorable="w14 w15 w16se w16cid w16 w16cex w16sdtdh w16sdtfl w16du wp14">
   <w:abstractNum w:abstractNumId="0" w15:restartNumberingAfterBreak="0">
     <w:nsid w:val="FFFFFF7C"/>
     <w:multiLevelType w:val="singleLevel"/>

</xml_diff>

<commit_message>
QLHT phân quyền/xem quyền, sửa Nơi nhận–danh xưng TQ và tạm ứng 10%.
Ẩn Admin khỏi danh sách tài khoản; slide phân quyền TP/PP/NV; chế độ Xem với quyền; ẩn XN đã sáp nhập; Nơi nhận theo XN giao; TQ = Bà; tạm ứng lần 1 = 10% GHĐ làm tròn triệu.

Co-authored-by: Cursor <cursoragent@cursor.com>
</commit_message>
<xml_diff>
--- a/public/templates/qd-giao-nhiem-vu-tnhc.docx
+++ b/public/templates/qd-giao-nhiem-vu-tnhc.docx
@@ -129,7 +129,7 @@
                 </mc:Choice>
                 <mc:Fallback>
                   <w:pict>
-                    <v:line w14:anchorId="53332AAC" id="Straight Connector 1" o:spid="_x0000_s1026" style="position:absolute;z-index:251657216;visibility:visible;mso-wrap-style:square;mso-wrap-distance-left:9pt;mso-wrap-distance-top:0;mso-wrap-distance-right:9pt;mso-wrap-distance-bottom:0;mso-position-horizontal:absolute;mso-position-horizontal-relative:margin;mso-position-vertical:absolute;mso-position-vertical-relative:text" from="41.45pt,14.15pt" to="147.2pt,14.15pt" o:gfxdata="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" strokecolor="black [3040]" strokeweight=".5pt">
+                    <v:line w14:anchorId="6D19A628" id="Straight Connector 1" o:spid="_x0000_s1026" style="position:absolute;z-index:251657216;visibility:visible;mso-wrap-style:square;mso-wrap-distance-left:9pt;mso-wrap-distance-top:0;mso-wrap-distance-right:9pt;mso-wrap-distance-bottom:0;mso-position-horizontal:absolute;mso-position-horizontal-relative:margin;mso-position-vertical:absolute;mso-position-vertical-relative:text" from="41.45pt,14.15pt" to="147.2pt,14.15pt" o:gfxdata="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" strokecolor="black [3040]" strokeweight=".5pt">
                       <w10:wrap anchorx="margin"/>
                     </v:line>
                   </w:pict>
@@ -280,7 +280,7 @@
                 </mc:Choice>
                 <mc:Fallback>
                   <w:pict>
-                    <v:line w14:anchorId="23BDD37E" id="Straight Connector 2" o:spid="_x0000_s1026" style="position:absolute;z-index:251660288;visibility:visible;mso-wrap-style:square;mso-width-percent:0;mso-wrap-distance-left:9pt;mso-wrap-distance-top:0;mso-wrap-distance-right:9pt;mso-wrap-distance-bottom:0;mso-position-horizontal:absolute;mso-position-horizontal-relative:margin;mso-position-vertical:absolute;mso-position-vertical-relative:text;mso-width-percent:0;mso-width-relative:margin" from="56.85pt,15.3pt" to="190.75pt,15.3pt" o:gfxdata="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" strokecolor="black [3040]" strokeweight=".5pt">
+                    <v:line w14:anchorId="5A166C12" id="Straight Connector 2" o:spid="_x0000_s1026" style="position:absolute;z-index:251660288;visibility:visible;mso-wrap-style:square;mso-width-percent:0;mso-wrap-distance-left:9pt;mso-wrap-distance-top:0;mso-wrap-distance-right:9pt;mso-wrap-distance-bottom:0;mso-position-horizontal:absolute;mso-position-horizontal-relative:margin;mso-position-vertical:absolute;mso-position-vertical-relative:text;mso-width-percent:0;mso-width-relative:margin" from="56.85pt,15.3pt" to="190.75pt,15.3pt" o:gfxdata="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" strokecolor="black [3040]" strokeweight=".5pt">
                       <w10:wrap anchorx="margin"/>
                     </v:line>
                   </w:pict>
@@ -658,7 +658,26 @@
           <w:sz w:val="26"/>
           <w:szCs w:val="26"/>
         </w:rPr>
-        <w:t xml:space="preserve">năm {nam_ke_hoach} cho </w:t>
+        <w:t xml:space="preserve">năm </w:t>
+      </w:r>
+      <w:r>
+        <w:rPr>
+          <w:rFonts w:ascii="Times New Roman" w:hAnsi="Times New Roman"/>
+          <w:i/>
+          <w:color w:val="0000CC"/>
+          <w:sz w:val="26"/>
+          <w:szCs w:val="26"/>
+        </w:rPr>
+        <w:t xml:space="preserve">{nam_ke_hoach} </w:t>
+      </w:r>
+      <w:r>
+        <w:rPr>
+          <w:rFonts w:ascii="Times New Roman" w:hAnsi="Times New Roman"/>
+          <w:i/>
+          <w:sz w:val="26"/>
+          <w:szCs w:val="26"/>
+        </w:rPr>
+        <w:t xml:space="preserve">cho </w:t>
       </w:r>
       <w:r>
         <w:rPr>
@@ -899,8 +918,7 @@
           <w:sz w:val="26"/>
           <w:szCs w:val="26"/>
         </w:rPr>
-        <w:lastRenderedPageBreak/>
-        <w:t xml:space="preserve">- Thời gian thực hiện: Hoàn thành công tác theo các điều khoản của Hợp đồng, các yêu cầu khác của Công ty Điện lực </w:t>
+        <w:t xml:space="preserve">- Thời gian thực hiện: Hoàn thành công tác theo các điều khoản của Hợp đồng, các yêu cầu khác của </w:t>
       </w:r>
       <w:r>
         <w:rPr>
@@ -935,6 +953,7 @@
           <w:sz w:val="26"/>
           <w:szCs w:val="26"/>
         </w:rPr>
+        <w:lastRenderedPageBreak/>
         <w:t>- Công tác tài chính: Căn cứ giá trị theo Hợp đồng ký kết, đơn vị hạch toán chi phí, tiền lương được hưởng theo quy chế tài chính do Công ty quy định.</w:t>
       </w:r>
     </w:p>
@@ -955,7 +974,16 @@
           <w:sz w:val="26"/>
           <w:szCs w:val="26"/>
         </w:rPr>
-        <w:t>Điều 3.</w:t>
+        <w:t xml:space="preserve">Điều 3. </w:t>
+      </w:r>
+      <w:r>
+        <w:rPr>
+          <w:rFonts w:ascii="Times New Roman" w:hAnsi="Times New Roman"/>
+          <w:color w:val="0000CC"/>
+          <w:sz w:val="26"/>
+          <w:szCs w:val="26"/>
+        </w:rPr>
+        <w:t>{danh_xung_gd_xn}</w:t>
       </w:r>
       <w:r>
         <w:rPr>
@@ -963,7 +991,7 @@
           <w:sz w:val="26"/>
           <w:szCs w:val="26"/>
         </w:rPr>
-        <w:t xml:space="preserve"> Giám đốc Xí nghiệp Dịch vụ Điện lực </w:t>
+        <w:t xml:space="preserve"> Giám đốc </w:t>
       </w:r>
       <w:r>
         <w:rPr>
@@ -972,7 +1000,7 @@
           <w:sz w:val="26"/>
           <w:szCs w:val="26"/>
         </w:rPr>
-        <w:t xml:space="preserve">{ten_xi_nghiep} </w:t>
+        <w:t>{ten_xi_nghiep}</w:t>
       </w:r>
       <w:r>
         <w:rPr>
@@ -1073,7 +1101,20 @@
               <w:rPr>
                 <w:rFonts w:ascii="Times New Roman" w:hAnsi="Times New Roman"/>
               </w:rPr>
-              <w:t>- XNDVĐL {ten_xi_nghiep} (để t/h);</w:t>
+              <w:t xml:space="preserve">- </w:t>
+            </w:r>
+            <w:r>
+              <w:rPr>
+                <w:rFonts w:ascii="Times New Roman" w:hAnsi="Times New Roman"/>
+                <w:color w:val="EE0000"/>
+              </w:rPr>
+              <w:t>{ten_xi_nghiep}</w:t>
+            </w:r>
+            <w:r>
+              <w:rPr>
+                <w:rFonts w:ascii="Times New Roman" w:hAnsi="Times New Roman"/>
+              </w:rPr>
+              <w:t xml:space="preserve"> (để t/h);</w:t>
             </w:r>
           </w:p>
           <w:p>
@@ -1166,6 +1207,30 @@
               <w:spacing w:after="0"/>
               <w:jc w:val="center"/>
               <w:rPr>
+                <w:sz w:val="26"/>
+                <w:szCs w:val="26"/>
+              </w:rPr>
+            </w:pPr>
+          </w:p>
+          <w:p>
+            <w:pPr>
+              <w:spacing w:after="0"/>
+              <w:jc w:val="center"/>
+              <w:rPr>
+                <w:rFonts w:ascii="Times New Roman" w:hAnsi="Times New Roman"/>
+                <w:b/>
+                <w:sz w:val="26"/>
+                <w:szCs w:val="26"/>
+              </w:rPr>
+            </w:pPr>
+          </w:p>
+          <w:p>
+            <w:pPr>
+              <w:spacing w:after="0"/>
+              <w:jc w:val="center"/>
+              <w:rPr>
+                <w:rFonts w:ascii="Times New Roman" w:hAnsi="Times New Roman"/>
+                <w:b/>
                 <w:sz w:val="26"/>
                 <w:szCs w:val="26"/>
               </w:rPr>

</xml_diff>

<commit_message>
Cập nhật mẫu Word Điều 3: danh xưng GD XN gọn, thống nhất các loại giao.
Co-authored-by: Cursor <cursoragent@cursor.com>
</commit_message>
<xml_diff>
--- a/public/templates/qd-giao-nhiem-vu-tnhc.docx
+++ b/public/templates/qd-giao-nhiem-vu-tnhc.docx
@@ -129,7 +129,7 @@
                 </mc:Choice>
                 <mc:Fallback>
                   <w:pict>
-                    <v:line w14:anchorId="6D19A628" id="Straight Connector 1" o:spid="_x0000_s1026" style="position:absolute;z-index:251657216;visibility:visible;mso-wrap-style:square;mso-wrap-distance-left:9pt;mso-wrap-distance-top:0;mso-wrap-distance-right:9pt;mso-wrap-distance-bottom:0;mso-position-horizontal:absolute;mso-position-horizontal-relative:margin;mso-position-vertical:absolute;mso-position-vertical-relative:text" from="41.45pt,14.15pt" to="147.2pt,14.15pt" o:gfxdata="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" strokecolor="black [3040]" strokeweight=".5pt">
+                    <v:line w14:anchorId="322CE97D" id="Straight Connector 1" o:spid="_x0000_s1026" style="position:absolute;z-index:251657216;visibility:visible;mso-wrap-style:square;mso-wrap-distance-left:9pt;mso-wrap-distance-top:0;mso-wrap-distance-right:9pt;mso-wrap-distance-bottom:0;mso-position-horizontal:absolute;mso-position-horizontal-relative:margin;mso-position-vertical:absolute;mso-position-vertical-relative:text" from="41.45pt,14.15pt" to="147.2pt,14.15pt" o:gfxdata="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" strokecolor="black [3040]" strokeweight=".5pt">
                       <w10:wrap anchorx="margin"/>
                     </v:line>
                   </w:pict>
@@ -143,25 +143,7 @@
                 <w:sz w:val="24"/>
                 <w:szCs w:val="24"/>
               </w:rPr>
-              <w:t>DỊCH VỤ ĐIỆN LỰC</w:t>
-            </w:r>
-            <w:r>
-              <w:rPr>
-                <w:rFonts w:ascii="Times New Roman" w:hAnsi="Times New Roman"/>
-                <w:b/>
-                <w:sz w:val="24"/>
-                <w:szCs w:val="24"/>
-              </w:rPr>
-              <w:t xml:space="preserve"> </w:t>
-            </w:r>
-            <w:r>
-              <w:rPr>
-                <w:rFonts w:ascii="Times New Roman" w:hAnsi="Times New Roman"/>
-                <w:b/>
-                <w:sz w:val="24"/>
-                <w:szCs w:val="24"/>
-              </w:rPr>
-              <w:t>MIỀN BẮC</w:t>
+              <w:t>DỊCH VỤ ĐIỆN LỰC MIỀN BẮC</w:t>
             </w:r>
           </w:p>
           <w:p>
@@ -280,7 +262,7 @@
                 </mc:Choice>
                 <mc:Fallback>
                   <w:pict>
-                    <v:line w14:anchorId="5A166C12" id="Straight Connector 2" o:spid="_x0000_s1026" style="position:absolute;z-index:251660288;visibility:visible;mso-wrap-style:square;mso-width-percent:0;mso-wrap-distance-left:9pt;mso-wrap-distance-top:0;mso-wrap-distance-right:9pt;mso-wrap-distance-bottom:0;mso-position-horizontal:absolute;mso-position-horizontal-relative:margin;mso-position-vertical:absolute;mso-position-vertical-relative:text;mso-width-percent:0;mso-width-relative:margin" from="56.85pt,15.3pt" to="190.75pt,15.3pt" o:gfxdata="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" strokecolor="black [3040]" strokeweight=".5pt">
+                    <v:line w14:anchorId="14FD922B" id="Straight Connector 2" o:spid="_x0000_s1026" style="position:absolute;z-index:251660288;visibility:visible;mso-wrap-style:square;mso-width-percent:0;mso-wrap-distance-left:9pt;mso-wrap-distance-top:0;mso-wrap-distance-right:9pt;mso-wrap-distance-bottom:0;mso-position-horizontal:absolute;mso-position-horizontal-relative:margin;mso-position-vertical:absolute;mso-position-vertical-relative:text;mso-width-percent:0;mso-width-relative:margin" from="56.85pt,15.3pt" to="190.75pt,15.3pt" o:gfxdata="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" strokecolor="black [3040]" strokeweight=".5pt">
                       <w10:wrap anchorx="margin"/>
                     </v:line>
                   </w:pict>
@@ -355,16 +337,7 @@
           <w:b/>
           <w:sz w:val="24"/>
         </w:rPr>
-        <w:t xml:space="preserve">Về việc giao nhiệm vụ cho </w:t>
-      </w:r>
-      <w:r>
-        <w:rPr>
-          <w:rFonts w:ascii="Times New Roman" w:hAnsi="Times New Roman"/>
-          <w:b/>
-          <w:color w:val="EE0000"/>
-          <w:sz w:val="24"/>
-        </w:rPr>
-        <w:t>{ten_xi_nghiep}</w:t>
+        <w:t>Về việc giao nhiệm vụ cho {ten_xi_nghiep}</w:t>
       </w:r>
       <w:r>
         <w:rPr>
@@ -373,24 +346,7 @@
           <w:sz w:val="24"/>
         </w:rPr>
         <w:br/>
-        <w:t xml:space="preserve">thực hiện gói thầu “Thí nghiệm hiệu chỉnh” </w:t>
-      </w:r>
-      <w:r>
-        <w:rPr>
-          <w:rFonts w:ascii="Times New Roman" w:hAnsi="Times New Roman"/>
-          <w:b/>
-          <w:color w:val="EE0000"/>
-          <w:sz w:val="24"/>
-        </w:rPr>
-        <w:t xml:space="preserve">{so_luong_cong_trinh} </w:t>
-      </w:r>
-      <w:r>
-        <w:rPr>
-          <w:rFonts w:ascii="Times New Roman" w:hAnsi="Times New Roman"/>
-          <w:b/>
-          <w:sz w:val="24"/>
-        </w:rPr>
-        <w:t>công trình ĐTXD</w:t>
+        <w:t>thực hiện gói thầu “Thí nghiệm hiệu chỉnh” {so_luong_cong_trinh} công trình ĐTXD</w:t>
       </w:r>
       <w:r>
         <w:rPr>
@@ -399,33 +355,7 @@
           <w:sz w:val="24"/>
         </w:rPr>
         <w:br/>
-        <w:t xml:space="preserve">năm {nam_ke_hoach} </w:t>
-      </w:r>
-      <w:r>
-        <w:rPr>
-          <w:rFonts w:ascii="Times New Roman" w:hAnsi="Times New Roman"/>
-          <w:b/>
-          <w:color w:val="EE0000"/>
-          <w:sz w:val="24"/>
-        </w:rPr>
-        <w:t xml:space="preserve">{ghi_chu_bo_sung} </w:t>
-      </w:r>
-      <w:r>
-        <w:rPr>
-          <w:rFonts w:ascii="Times New Roman" w:hAnsi="Times New Roman"/>
-          <w:b/>
-          <w:sz w:val="24"/>
-        </w:rPr>
-        <w:t xml:space="preserve">cho </w:t>
-      </w:r>
-      <w:r>
-        <w:rPr>
-          <w:rFonts w:ascii="Times New Roman" w:hAnsi="Times New Roman"/>
-          <w:b/>
-          <w:color w:val="EE0000"/>
-          <w:sz w:val="24"/>
-        </w:rPr>
-        <w:t>{ten_pc_tinh}</w:t>
+        <w:t>năm {nam_ke_hoach} {ghi_chu_bo_sung} cho {ten_pc_tinh}</w:t>
       </w:r>
     </w:p>
     <w:p>
@@ -481,26 +411,7 @@
           <w:sz w:val="26"/>
           <w:szCs w:val="26"/>
         </w:rPr>
-        <w:t xml:space="preserve">Căn cứ Quyết định số </w:t>
-      </w:r>
-      <w:r>
-        <w:rPr>
-          <w:rFonts w:ascii="Times New Roman" w:hAnsi="Times New Roman"/>
-          <w:i/>
-          <w:color w:val="EE0000"/>
-          <w:sz w:val="26"/>
-          <w:szCs w:val="26"/>
-        </w:rPr>
-        <w:t xml:space="preserve">4157/QĐ-EVNNPC ngày 27/12/2018 (hoặc số 4175/QĐ-EVNNPC ngày 27/12/2018) </w:t>
-      </w:r>
-      <w:r>
-        <w:rPr>
-          <w:rFonts w:ascii="Times New Roman" w:hAnsi="Times New Roman"/>
-          <w:i/>
-          <w:sz w:val="26"/>
-          <w:szCs w:val="26"/>
-        </w:rPr>
-        <w:t>của Tổng công ty Điện lực miền Bắc về việc ban hành Quy chế tổ chức và hoạt động của Công ty Dịch vụ Điện lực miền Bắc thuộc Tổng công ty Điện lực miền Bắc;</w:t>
+        <w:t>Căn cứ Quyết định số 4157/QĐ-EVNNPC ngày 27/12/2018 (hoặc số 4175/QĐ-EVNNPC ngày 27/12/2018) của Tổng công ty Điện lực miền Bắc về việc ban hành Quy chế tổ chức và hoạt động của Công ty Dịch vụ Điện lực miền Bắc thuộc Tổng công ty Điện lực miền Bắc;</w:t>
       </w:r>
     </w:p>
     <w:p>
@@ -522,64 +433,7 @@
           <w:sz w:val="26"/>
           <w:szCs w:val="26"/>
         </w:rPr>
-        <w:t xml:space="preserve">Căn cứ Quyết định số </w:t>
-      </w:r>
-      <w:r>
-        <w:rPr>
-          <w:rFonts w:ascii="Times New Roman" w:hAnsi="Times New Roman"/>
-          <w:i/>
-          <w:color w:val="EE0000"/>
-          <w:sz w:val="26"/>
-          <w:szCs w:val="26"/>
-        </w:rPr>
-        <w:t>{so_qd_thanh_lap_xn}</w:t>
-      </w:r>
-      <w:r>
-        <w:rPr>
-          <w:rFonts w:ascii="Times New Roman" w:hAnsi="Times New Roman"/>
-          <w:i/>
-          <w:sz w:val="26"/>
-          <w:szCs w:val="26"/>
-        </w:rPr>
-        <w:t xml:space="preserve"> ngày </w:t>
-      </w:r>
-      <w:r>
-        <w:rPr>
-          <w:rFonts w:ascii="Times New Roman" w:hAnsi="Times New Roman"/>
-          <w:i/>
-          <w:color w:val="EE0000"/>
-          <w:sz w:val="26"/>
-          <w:szCs w:val="26"/>
-        </w:rPr>
-        <w:t xml:space="preserve">{ngay_qd_thanh_lap_xn} </w:t>
-      </w:r>
-      <w:r>
-        <w:rPr>
-          <w:rFonts w:ascii="Times New Roman" w:hAnsi="Times New Roman"/>
-          <w:i/>
-          <w:sz w:val="26"/>
-          <w:szCs w:val="26"/>
-        </w:rPr>
-        <w:t xml:space="preserve">của Tổng công ty Điện lực miền Bắc về việc thành lập </w:t>
-      </w:r>
-      <w:r>
-        <w:rPr>
-          <w:rFonts w:ascii="Times New Roman" w:hAnsi="Times New Roman"/>
-          <w:i/>
-          <w:color w:val="EE0000"/>
-          <w:sz w:val="26"/>
-          <w:szCs w:val="26"/>
-        </w:rPr>
-        <w:t xml:space="preserve">{ten_xi_nghiep} </w:t>
-      </w:r>
-      <w:r>
-        <w:rPr>
-          <w:rFonts w:ascii="Times New Roman" w:hAnsi="Times New Roman"/>
-          <w:i/>
-          <w:sz w:val="26"/>
-          <w:szCs w:val="26"/>
-        </w:rPr>
-        <w:t>trực thuộc Công ty Dịch vụ Điện lực miền Bắc;</w:t>
+        <w:t>Căn cứ Quyết định số {so_qd_thanh_lap_xn} ngày {ngay_qd_thanh_lap_xn} của Tổng công ty Điện lực miền Bắc về việc thành lập {ten_xi_nghiep} trực thuộc Công ty Dịch vụ Điện lực miền Bắc;</w:t>
       </w:r>
     </w:p>
     <w:p>
@@ -601,102 +455,7 @@
           <w:sz w:val="26"/>
           <w:szCs w:val="26"/>
         </w:rPr>
-        <w:t xml:space="preserve">Căn cứ Quyết định số </w:t>
-      </w:r>
-      <w:r>
-        <w:rPr>
-          <w:rFonts w:ascii="Times New Roman" w:hAnsi="Times New Roman"/>
-          <w:i/>
-          <w:color w:val="EE0000"/>
-          <w:sz w:val="26"/>
-          <w:szCs w:val="26"/>
-        </w:rPr>
-        <w:t xml:space="preserve">{so_qd_tam_giao_khv} </w:t>
-      </w:r>
-      <w:r>
-        <w:rPr>
-          <w:rFonts w:ascii="Times New Roman" w:hAnsi="Times New Roman"/>
-          <w:i/>
-          <w:sz w:val="26"/>
-          <w:szCs w:val="26"/>
-        </w:rPr>
-        <w:t xml:space="preserve">ngày </w:t>
-      </w:r>
-      <w:r>
-        <w:rPr>
-          <w:rFonts w:ascii="Times New Roman" w:hAnsi="Times New Roman"/>
-          <w:i/>
-          <w:color w:val="EE0000"/>
-          <w:sz w:val="26"/>
-          <w:szCs w:val="26"/>
-        </w:rPr>
-        <w:t xml:space="preserve">{ngay_qd_tam_giao_khv} </w:t>
-      </w:r>
-      <w:r>
-        <w:rPr>
-          <w:rFonts w:ascii="Times New Roman" w:hAnsi="Times New Roman"/>
-          <w:i/>
-          <w:sz w:val="26"/>
-          <w:szCs w:val="26"/>
-        </w:rPr>
-        <w:t xml:space="preserve">của Tổng công ty Điện lực miền Bắc về việc duyệt danh mục và tạm giao KHV công trình ĐTXD </w:t>
-      </w:r>
-      <w:r>
-        <w:rPr>
-          <w:rFonts w:ascii="Times New Roman" w:hAnsi="Times New Roman"/>
-          <w:i/>
-          <w:color w:val="EE0000"/>
-          <w:sz w:val="26"/>
-          <w:szCs w:val="26"/>
-        </w:rPr>
-        <w:t xml:space="preserve">{ghi_chu_bo_sung} </w:t>
-      </w:r>
-      <w:r>
-        <w:rPr>
-          <w:rFonts w:ascii="Times New Roman" w:hAnsi="Times New Roman"/>
-          <w:i/>
-          <w:sz w:val="26"/>
-          <w:szCs w:val="26"/>
-        </w:rPr>
-        <w:t xml:space="preserve">năm </w:t>
-      </w:r>
-      <w:r>
-        <w:rPr>
-          <w:rFonts w:ascii="Times New Roman" w:hAnsi="Times New Roman"/>
-          <w:i/>
-          <w:color w:val="0000CC"/>
-          <w:sz w:val="26"/>
-          <w:szCs w:val="26"/>
-        </w:rPr>
-        <w:t xml:space="preserve">{nam_ke_hoach} </w:t>
-      </w:r>
-      <w:r>
-        <w:rPr>
-          <w:rFonts w:ascii="Times New Roman" w:hAnsi="Times New Roman"/>
-          <w:i/>
-          <w:sz w:val="26"/>
-          <w:szCs w:val="26"/>
-        </w:rPr>
-        <w:t xml:space="preserve">cho </w:t>
-      </w:r>
-      <w:r>
-        <w:rPr>
-          <w:rFonts w:ascii="Times New Roman" w:hAnsi="Times New Roman"/>
-          <w:i/>
-          <w:color w:val="EE0000"/>
-          <w:sz w:val="26"/>
-          <w:szCs w:val="26"/>
-        </w:rPr>
-        <w:t>{ten_pc_tinh}</w:t>
-      </w:r>
-      <w:r>
-        <w:rPr>
-          <w:rFonts w:ascii="Times New Roman" w:hAnsi="Times New Roman"/>
-          <w:i/>
-          <w:sz w:val="26"/>
-          <w:szCs w:val="26"/>
-        </w:rPr>
-        <w:t xml:space="preserve">; </w:t>
+        <w:t xml:space="preserve">Căn cứ Quyết định số {so_qd_tam_giao_khv} ngày {ngay_qd_tam_giao_khv} của Tổng công ty Điện lực miền Bắc về việc duyệt danh mục và tạm giao KHV công trình ĐTXD {ghi_chu_bo_sung} năm {nam_ke_hoach} cho {ten_pc_tinh}; </w:t>
       </w:r>
     </w:p>
     <w:p>
@@ -762,11 +521,11 @@
     </w:p>
     <w:p>
       <w:pPr>
-        <w:spacing w:after="120"/>
-        <w:jc w:val="center"/>
+        <w:spacing w:after="0" w:line="312" w:lineRule="auto"/>
+        <w:ind w:firstLine="720"/>
+        <w:jc w:val="both"/>
         <w:rPr>
-          <w:i/>
-          <w:iCs/>
+          <w:rFonts w:ascii="Times New Roman" w:hAnsi="Times New Roman"/>
           <w:sz w:val="26"/>
           <w:szCs w:val="26"/>
         </w:rPr>
@@ -779,7 +538,7 @@
           <w:sz w:val="26"/>
           <w:szCs w:val="26"/>
         </w:rPr>
-        <w:t>Điều 1.</w:t>
+        <w:t xml:space="preserve">Điều 1. </w:t>
       </w:r>
       <w:r>
         <w:rPr>
@@ -787,84 +546,21 @@
           <w:sz w:val="26"/>
           <w:szCs w:val="26"/>
         </w:rPr>
-        <w:t xml:space="preserve"> Giao nhiệm vụ cho </w:t>
+        <w:t>Giao nhiệm vụ cho {ten_xi_nghiep} triển khai thực hiện gói thầu “Thí nghiệm hiệu chỉnh” {so_luong_cong_trinh} công trình ĐTXD năm {nam_ke_hoach} {ghi_chu_bo_sung_dieu1} cho {ten_pc_tinh}.</w:t>
       </w:r>
-      <w:r>
+    </w:p>
+    <w:p>
+      <w:pPr>
+        <w:spacing w:after="0" w:line="312" w:lineRule="auto"/>
+        <w:jc w:val="center"/>
         <w:rPr>
           <w:rFonts w:ascii="Times New Roman" w:hAnsi="Times New Roman"/>
-          <w:color w:val="EE0000"/>
+          <w:i/>
+          <w:iCs/>
           <w:sz w:val="26"/>
           <w:szCs w:val="26"/>
         </w:rPr>
-        <w:t xml:space="preserve">{ten_xi_nghiep} </w:t>
-      </w:r>
-      <w:r>
-        <w:rPr>
-          <w:rFonts w:ascii="Times New Roman" w:hAnsi="Times New Roman"/>
-          <w:sz w:val="26"/>
-          <w:szCs w:val="26"/>
-        </w:rPr>
-        <w:t xml:space="preserve">triển khai thực hiện gói thầu “Thí nghiệm hiệu chỉnh” </w:t>
-      </w:r>
-      <w:r>
-        <w:rPr>
-          <w:rFonts w:ascii="Times New Roman" w:hAnsi="Times New Roman"/>
-          <w:color w:val="EE0000"/>
-          <w:sz w:val="26"/>
-          <w:szCs w:val="26"/>
-        </w:rPr>
-        <w:t xml:space="preserve">{so_luong_cong_trinh} </w:t>
-      </w:r>
-      <w:r>
-        <w:rPr>
-          <w:rFonts w:ascii="Times New Roman" w:hAnsi="Times New Roman"/>
-          <w:sz w:val="26"/>
-          <w:szCs w:val="26"/>
-        </w:rPr>
-        <w:t xml:space="preserve">công trình ĐTXD năm {nam_ke_hoach} </w:t>
-      </w:r>
-      <w:r>
-        <w:rPr>
-          <w:rFonts w:ascii="Times New Roman" w:hAnsi="Times New Roman"/>
-          <w:color w:val="EE0000"/>
-          <w:sz w:val="26"/>
-          <w:szCs w:val="26"/>
-        </w:rPr>
-        <w:t>{ghi_chu_bo_sung_dieu1}</w:t>
-      </w:r>
-      <w:r>
-        <w:rPr>
-          <w:rFonts w:ascii="Times New Roman" w:hAnsi="Times New Roman"/>
-          <w:sz w:val="26"/>
-          <w:szCs w:val="26"/>
-        </w:rPr>
-        <w:t xml:space="preserve"> cho </w:t>
-      </w:r>
-      <w:r>
-        <w:rPr>
-          <w:rFonts w:ascii="Times New Roman" w:hAnsi="Times New Roman"/>
-          <w:color w:val="EE0000"/>
-          <w:sz w:val="26"/>
-          <w:szCs w:val="26"/>
-        </w:rPr>
-        <w:t>{ten_pc_tinh}</w:t>
-      </w:r>
-      <w:r>
-        <w:rPr>
-          <w:rFonts w:ascii="Times New Roman" w:hAnsi="Times New Roman"/>
-          <w:sz w:val="26"/>
-          <w:szCs w:val="26"/>
-        </w:rPr>
-        <w:t>.</w:t>
-      </w:r>
-      <w:r>
-        <w:rPr>
-          <w:rFonts w:ascii="Times New Roman" w:hAnsi="Times New Roman"/>
-          <w:sz w:val="26"/>
-          <w:szCs w:val="26"/>
-        </w:rPr>
-        <w:br/>
-      </w:r>
+      </w:pPr>
       <w:r>
         <w:rPr>
           <w:rFonts w:ascii="Times New Roman" w:hAnsi="Times New Roman"/>
@@ -878,7 +574,8 @@
     </w:p>
     <w:p>
       <w:pPr>
-        <w:spacing w:after="120"/>
+        <w:spacing w:after="0" w:line="312" w:lineRule="auto"/>
+        <w:ind w:firstLine="720"/>
         <w:rPr>
           <w:sz w:val="26"/>
           <w:szCs w:val="26"/>
@@ -905,42 +602,8 @@
     </w:p>
     <w:p>
       <w:pPr>
-        <w:spacing w:after="120"/>
-        <w:jc w:val="both"/>
-        <w:rPr>
-          <w:sz w:val="26"/>
-          <w:szCs w:val="26"/>
-        </w:rPr>
-      </w:pPr>
-      <w:r>
-        <w:rPr>
-          <w:rFonts w:ascii="Times New Roman" w:hAnsi="Times New Roman"/>
-          <w:sz w:val="26"/>
-          <w:szCs w:val="26"/>
-        </w:rPr>
-        <w:t xml:space="preserve">- Thời gian thực hiện: Hoàn thành công tác theo các điều khoản của Hợp đồng, các yêu cầu khác của </w:t>
-      </w:r>
-      <w:r>
-        <w:rPr>
-          <w:rFonts w:ascii="Times New Roman" w:hAnsi="Times New Roman"/>
-          <w:color w:val="EE0000"/>
-          <w:sz w:val="26"/>
-          <w:szCs w:val="26"/>
-        </w:rPr>
-        <w:t xml:space="preserve">{ten_pc_tinh} </w:t>
-      </w:r>
-      <w:r>
-        <w:rPr>
-          <w:rFonts w:ascii="Times New Roman" w:hAnsi="Times New Roman"/>
-          <w:sz w:val="26"/>
-          <w:szCs w:val="26"/>
-        </w:rPr>
-        <w:t>và Tổng công ty Điện lực miền Bắc (nếu có).</w:t>
-      </w:r>
-    </w:p>
-    <w:p>
-      <w:pPr>
-        <w:spacing w:after="120"/>
+        <w:spacing w:after="0" w:line="312" w:lineRule="auto"/>
+        <w:ind w:firstLine="720"/>
         <w:jc w:val="both"/>
         <w:rPr>
           <w:sz w:val="26"/>
@@ -954,12 +617,32 @@
           <w:szCs w:val="26"/>
         </w:rPr>
         <w:lastRenderedPageBreak/>
+        <w:t>- Thời gian thực hiện: Hoàn thành công tác theo các điều khoản của Hợp đồng, các yêu cầu khác của {ten_pc_tinh} và Tổng công ty Điện lực miền Bắc (nếu có).</w:t>
+      </w:r>
+    </w:p>
+    <w:p>
+      <w:pPr>
+        <w:spacing w:after="0" w:line="312" w:lineRule="auto"/>
+        <w:ind w:firstLine="720"/>
+        <w:jc w:val="both"/>
+        <w:rPr>
+          <w:sz w:val="26"/>
+          <w:szCs w:val="26"/>
+        </w:rPr>
+      </w:pPr>
+      <w:r>
+        <w:rPr>
+          <w:rFonts w:ascii="Times New Roman" w:hAnsi="Times New Roman"/>
+          <w:sz w:val="26"/>
+          <w:szCs w:val="26"/>
+        </w:rPr>
         <w:t>- Công tác tài chính: Căn cứ giá trị theo Hợp đồng ký kết, đơn vị hạch toán chi phí, tiền lương được hưởng theo quy chế tài chính do Công ty quy định.</w:t>
       </w:r>
     </w:p>
     <w:p>
       <w:pPr>
-        <w:spacing w:after="360"/>
+        <w:spacing w:after="0" w:line="312" w:lineRule="auto"/>
+        <w:ind w:firstLine="720"/>
         <w:jc w:val="both"/>
         <w:rPr>
           <w:sz w:val="26"/>
@@ -979,36 +662,10 @@
       <w:r>
         <w:rPr>
           <w:rFonts w:ascii="Times New Roman" w:hAnsi="Times New Roman"/>
-          <w:color w:val="0000CC"/>
           <w:sz w:val="26"/>
           <w:szCs w:val="26"/>
         </w:rPr>
-        <w:t>{danh_xung_gd_xn}</w:t>
-      </w:r>
-      <w:r>
-        <w:rPr>
-          <w:rFonts w:ascii="Times New Roman" w:hAnsi="Times New Roman"/>
-          <w:sz w:val="26"/>
-          <w:szCs w:val="26"/>
-        </w:rPr>
-        <w:t xml:space="preserve"> Giám đốc </w:t>
-      </w:r>
-      <w:r>
-        <w:rPr>
-          <w:rFonts w:ascii="Times New Roman" w:hAnsi="Times New Roman"/>
-          <w:color w:val="EE0000"/>
-          <w:sz w:val="26"/>
-          <w:szCs w:val="26"/>
-        </w:rPr>
-        <w:t>{ten_xi_nghiep}</w:t>
-      </w:r>
-      <w:r>
-        <w:rPr>
-          <w:rFonts w:ascii="Times New Roman" w:hAnsi="Times New Roman"/>
-          <w:sz w:val="26"/>
-          <w:szCs w:val="26"/>
-        </w:rPr>
-        <w:t>và Trưởng các phòng chức năng Công ty chịu trách nhiệm thi hành Quyết định này./.</w:t>
+        <w:t>{danh_xung_gd_xn} Giám đốc {ten_xi_nghiep}và Trưởng các phòng chức năng Công ty chịu trách nhiệm thi hành Quyết định này./.</w:t>
       </w:r>
     </w:p>
     <w:tbl>
@@ -1101,20 +758,7 @@
               <w:rPr>
                 <w:rFonts w:ascii="Times New Roman" w:hAnsi="Times New Roman"/>
               </w:rPr>
-              <w:t xml:space="preserve">- </w:t>
-            </w:r>
-            <w:r>
-              <w:rPr>
-                <w:rFonts w:ascii="Times New Roman" w:hAnsi="Times New Roman"/>
-                <w:color w:val="EE0000"/>
-              </w:rPr>
-              <w:t>{ten_xi_nghiep}</w:t>
-            </w:r>
-            <w:r>
-              <w:rPr>
-                <w:rFonts w:ascii="Times New Roman" w:hAnsi="Times New Roman"/>
-              </w:rPr>
-              <w:t xml:space="preserve"> (để t/h);</w:t>
+              <w:t>- {ten_xi_nghiep} (để t/h);</w:t>
             </w:r>
           </w:p>
           <w:p>
@@ -1300,15 +944,11 @@
       <w:pPr>
         <w:spacing w:after="80"/>
         <w:jc w:val="center"/>
-        <w:rPr>
-          <w:color w:val="EE0000"/>
-        </w:rPr>
       </w:pPr>
       <w:r>
         <w:rPr>
           <w:rFonts w:ascii="Times New Roman" w:hAnsi="Times New Roman"/>
           <w:b/>
-          <w:color w:val="EE0000"/>
           <w:sz w:val="26"/>
         </w:rPr>
         <w:t>DANH MỤC CÔNG TRÌNH / KẾ HOẠCH ĐTXD NĂM {nam_ke_hoach} {ghi_chu_bo_sung}</w:t>
@@ -1317,7 +957,6 @@
         <w:rPr>
           <w:rFonts w:ascii="Times New Roman" w:hAnsi="Times New Roman"/>
           <w:b/>
-          <w:color w:val="EE0000"/>
           <w:sz w:val="26"/>
         </w:rPr>
         <w:t xml:space="preserve"> –</w:t>
@@ -1326,7 +965,6 @@
         <w:rPr>
           <w:rFonts w:ascii="Times New Roman" w:hAnsi="Times New Roman"/>
           <w:b/>
-          <w:color w:val="EE0000"/>
           <w:sz w:val="26"/>
         </w:rPr>
         <w:t xml:space="preserve"> </w:t>
@@ -1335,7 +973,6 @@
         <w:rPr>
           <w:rFonts w:ascii="Times New Roman" w:hAnsi="Times New Roman"/>
           <w:b/>
-          <w:color w:val="EE0000"/>
           <w:sz w:val="26"/>
         </w:rPr>
         <w:t>{ten_pc_tinh}</w:t>
@@ -1415,14 +1052,12 @@
               <w:jc w:val="center"/>
               <w:rPr>
                 <w:rFonts w:ascii="Times New Roman" w:hAnsi="Times New Roman" w:cs="Times New Roman"/>
-                <w:color w:val="EE0000"/>
               </w:rPr>
             </w:pPr>
             <w:r>
               <w:rPr>
                 <w:rFonts w:ascii="Times New Roman" w:hAnsi="Times New Roman" w:cs="Times New Roman"/>
                 <w:b/>
-                <w:color w:val="EE0000"/>
               </w:rPr>
               <w:t>STT</w:t>
             </w:r>
@@ -1446,14 +1081,12 @@
               <w:jc w:val="center"/>
               <w:rPr>
                 <w:rFonts w:ascii="Times New Roman" w:hAnsi="Times New Roman" w:cs="Times New Roman"/>
-                <w:color w:val="EE0000"/>
               </w:rPr>
             </w:pPr>
             <w:r>
               <w:rPr>
                 <w:rFonts w:ascii="Times New Roman" w:hAnsi="Times New Roman" w:cs="Times New Roman"/>
                 <w:b/>
-                <w:color w:val="EE0000"/>
               </w:rPr>
               <w:t>Tên danh mục</w:t>
             </w:r>
@@ -1477,14 +1110,12 @@
               <w:jc w:val="center"/>
               <w:rPr>
                 <w:rFonts w:ascii="Times New Roman" w:hAnsi="Times New Roman" w:cs="Times New Roman"/>
-                <w:color w:val="EE0000"/>
               </w:rPr>
             </w:pPr>
             <w:r>
               <w:rPr>
                 <w:rFonts w:ascii="Times New Roman" w:hAnsi="Times New Roman" w:cs="Times New Roman"/>
                 <w:b/>
-                <w:color w:val="EE0000"/>
               </w:rPr>
               <w:t>Quy mô đầu tư</w:t>
             </w:r>
@@ -1492,7 +1123,6 @@
               <w:rPr>
                 <w:rFonts w:ascii="Times New Roman" w:hAnsi="Times New Roman" w:cs="Times New Roman"/>
                 <w:b/>
-                <w:color w:val="EE0000"/>
               </w:rPr>
               <w:br/>
               <w:t>(sơ bộ)</w:t>
@@ -1512,14 +1142,12 @@
               <w:rPr>
                 <w:rFonts w:ascii="Times New Roman" w:hAnsi="Times New Roman" w:cs="Times New Roman"/>
                 <w:b/>
-                <w:color w:val="EE0000"/>
               </w:rPr>
             </w:pPr>
             <w:r>
               <w:rPr>
                 <w:rFonts w:ascii="Times New Roman" w:hAnsi="Times New Roman" w:cs="Times New Roman"/>
                 <w:b/>
-                <w:color w:val="EE0000"/>
               </w:rPr>
               <w:t>TMĐT</w:t>
             </w:r>
@@ -1531,14 +1159,12 @@
               <w:rPr>
                 <w:rFonts w:ascii="Times New Roman" w:hAnsi="Times New Roman" w:cs="Times New Roman"/>
                 <w:b/>
-                <w:color w:val="EE0000"/>
               </w:rPr>
             </w:pPr>
             <w:r>
               <w:rPr>
                 <w:rFonts w:ascii="Times New Roman" w:hAnsi="Times New Roman" w:cs="Times New Roman"/>
                 <w:b/>
-                <w:color w:val="EE0000"/>
               </w:rPr>
               <w:t>(Sơ bộ)</w:t>
             </w:r>
@@ -1563,14 +1189,12 @@
               <w:rPr>
                 <w:rFonts w:ascii="Times New Roman" w:hAnsi="Times New Roman" w:cs="Times New Roman"/>
                 <w:b/>
-                <w:color w:val="EE0000"/>
               </w:rPr>
             </w:pPr>
             <w:r>
               <w:rPr>
                 <w:rFonts w:ascii="Times New Roman" w:hAnsi="Times New Roman" w:cs="Times New Roman"/>
                 <w:b/>
-                <w:color w:val="EE0000"/>
               </w:rPr>
               <w:t xml:space="preserve">Giá trị KHV </w:t>
             </w:r>
@@ -1578,7 +1202,6 @@
               <w:rPr>
                 <w:rFonts w:ascii="Times New Roman" w:hAnsi="Times New Roman" w:cs="Times New Roman"/>
                 <w:b/>
-                <w:color w:val="EE0000"/>
               </w:rPr>
               <w:t>{nam_ke_hoach}</w:t>
             </w:r>
@@ -1591,7 +1214,6 @@
                 <w:rFonts w:ascii="Times New Roman" w:hAnsi="Times New Roman" w:cs="Times New Roman"/>
                 <w:i/>
                 <w:iCs/>
-                <w:color w:val="EE0000"/>
               </w:rPr>
             </w:pPr>
             <w:r>
@@ -1600,7 +1222,6 @@
                 <w:b/>
                 <w:i/>
                 <w:iCs/>
-                <w:color w:val="EE0000"/>
               </w:rPr>
               <w:t>(Tạm tính)</w:t>
             </w:r>
@@ -1624,14 +1245,12 @@
               <w:jc w:val="center"/>
               <w:rPr>
                 <w:rFonts w:ascii="Times New Roman" w:hAnsi="Times New Roman" w:cs="Times New Roman"/>
-                <w:color w:val="EE0000"/>
               </w:rPr>
             </w:pPr>
             <w:r>
               <w:rPr>
                 <w:rFonts w:ascii="Times New Roman" w:hAnsi="Times New Roman" w:cs="Times New Roman"/>
                 <w:b/>
-                <w:color w:val="EE0000"/>
               </w:rPr>
               <w:t>Thời gian</w:t>
             </w:r>
@@ -1639,7 +1258,6 @@
               <w:rPr>
                 <w:rFonts w:ascii="Times New Roman" w:hAnsi="Times New Roman" w:cs="Times New Roman"/>
                 <w:b/>
-                <w:color w:val="EE0000"/>
               </w:rPr>
               <w:br/>
               <w:t>hoàn</w:t>
@@ -1648,7 +1266,6 @@
               <w:rPr>
                 <w:rFonts w:ascii="Times New Roman" w:hAnsi="Times New Roman" w:cs="Times New Roman"/>
                 <w:b/>
-                <w:color w:val="EE0000"/>
               </w:rPr>
               <w:br/>
               <w:t>thành</w:t>
@@ -1856,14 +1473,12 @@
               <w:jc w:val="center"/>
               <w:rPr>
                 <w:rFonts w:ascii="Times New Roman" w:hAnsi="Times New Roman" w:cs="Times New Roman"/>
-                <w:color w:val="EE0000"/>
               </w:rPr>
             </w:pPr>
             <w:r>
               <w:rPr>
                 <w:rFonts w:ascii="Times New Roman" w:hAnsi="Times New Roman" w:cs="Times New Roman"/>
                 <w:b/>
-                <w:color w:val="EE0000"/>
               </w:rPr>
               <w:t>Tổng cộng</w:t>
             </w:r>
@@ -1881,14 +1496,12 @@
               <w:rPr>
                 <w:rFonts w:ascii="Times New Roman" w:hAnsi="Times New Roman" w:cs="Times New Roman"/>
                 <w:b/>
-                <w:color w:val="EE0000"/>
               </w:rPr>
             </w:pPr>
             <w:r>
               <w:rPr>
                 <w:rFonts w:ascii="Times New Roman" w:hAnsi="Times New Roman" w:cs="Times New Roman"/>
                 <w:b/>
-                <w:color w:val="EE0000"/>
               </w:rPr>
               <w:t>{tong_tmdt}</w:t>
             </w:r>
@@ -1911,14 +1524,12 @@
               <w:jc w:val="center"/>
               <w:rPr>
                 <w:rFonts w:ascii="Times New Roman" w:hAnsi="Times New Roman" w:cs="Times New Roman"/>
-                <w:color w:val="EE0000"/>
               </w:rPr>
             </w:pPr>
             <w:r>
               <w:rPr>
                 <w:rFonts w:ascii="Times New Roman" w:hAnsi="Times New Roman" w:cs="Times New Roman"/>
                 <w:b/>
-                <w:color w:val="EE0000"/>
               </w:rPr>
               <w:t>{tong_khv}</w:t>
             </w:r>
@@ -1941,14 +1552,12 @@
               <w:jc w:val="center"/>
               <w:rPr>
                 <w:rFonts w:ascii="Times New Roman" w:hAnsi="Times New Roman" w:cs="Times New Roman"/>
-                <w:color w:val="EE0000"/>
               </w:rPr>
             </w:pPr>
             <w:r>
               <w:rPr>
                 <w:rFonts w:ascii="Times New Roman" w:hAnsi="Times New Roman" w:cs="Times New Roman"/>
                 <w:b/>
-                <w:color w:val="EE0000"/>
               </w:rPr>
               <w:t>{tong_tdtm}</w:t>
             </w:r>
@@ -1971,14 +1580,12 @@
               <w:jc w:val="center"/>
               <w:rPr>
                 <w:rFonts w:ascii="Times New Roman" w:hAnsi="Times New Roman" w:cs="Times New Roman"/>
-                <w:color w:val="EE0000"/>
               </w:rPr>
             </w:pPr>
             <w:r>
               <w:rPr>
                 <w:rFonts w:ascii="Times New Roman" w:hAnsi="Times New Roman" w:cs="Times New Roman"/>
                 <w:b/>
-                <w:color w:val="EE0000"/>
               </w:rPr>
               <w:t>{tong_khcb}</w:t>
             </w:r>
@@ -2000,7 +1607,6 @@
               <w:spacing w:after="0"/>
               <w:rPr>
                 <w:rFonts w:ascii="Times New Roman" w:hAnsi="Times New Roman" w:cs="Times New Roman"/>
-                <w:color w:val="EE0000"/>
               </w:rPr>
             </w:pPr>
           </w:p>

</xml_diff>

<commit_message>
Gọn mục Nơi nhận trên 4 mẫu Word QĐ giao Xí nghiệp.
Co-authored-by: Cursor <cursoragent@cursor.com>
</commit_message>
<xml_diff>
--- a/public/templates/qd-giao-nhiem-vu-tnhc.docx
+++ b/public/templates/qd-giao-nhiem-vu-tnhc.docx
@@ -129,7 +129,7 @@
                 </mc:Choice>
                 <mc:Fallback>
                   <w:pict>
-                    <v:line w14:anchorId="322CE97D" id="Straight Connector 1" o:spid="_x0000_s1026" style="position:absolute;z-index:251657216;visibility:visible;mso-wrap-style:square;mso-wrap-distance-left:9pt;mso-wrap-distance-top:0;mso-wrap-distance-right:9pt;mso-wrap-distance-bottom:0;mso-position-horizontal:absolute;mso-position-horizontal-relative:margin;mso-position-vertical:absolute;mso-position-vertical-relative:text" from="41.45pt,14.15pt" to="147.2pt,14.15pt" o:gfxdata="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" strokecolor="black [3040]" strokeweight=".5pt">
+                    <v:line w14:anchorId="4B532870" id="Straight Connector 1" o:spid="_x0000_s1026" style="position:absolute;z-index:251657216;visibility:visible;mso-wrap-style:square;mso-wrap-distance-left:9pt;mso-wrap-distance-top:0;mso-wrap-distance-right:9pt;mso-wrap-distance-bottom:0;mso-position-horizontal:absolute;mso-position-horizontal-relative:margin;mso-position-vertical:absolute;mso-position-vertical-relative:text" from="41.45pt,14.15pt" to="147.2pt,14.15pt" o:gfxdata="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" strokecolor="black [3040]" strokeweight=".5pt">
                       <w10:wrap anchorx="margin"/>
                     </v:line>
                   </w:pict>
@@ -262,7 +262,7 @@
                 </mc:Choice>
                 <mc:Fallback>
                   <w:pict>
-                    <v:line w14:anchorId="14FD922B" id="Straight Connector 2" o:spid="_x0000_s1026" style="position:absolute;z-index:251660288;visibility:visible;mso-wrap-style:square;mso-width-percent:0;mso-wrap-distance-left:9pt;mso-wrap-distance-top:0;mso-wrap-distance-right:9pt;mso-wrap-distance-bottom:0;mso-position-horizontal:absolute;mso-position-horizontal-relative:margin;mso-position-vertical:absolute;mso-position-vertical-relative:text;mso-width-percent:0;mso-width-relative:margin" from="56.85pt,15.3pt" to="190.75pt,15.3pt" o:gfxdata="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" strokecolor="black [3040]" strokeweight=".5pt">
+                    <v:line w14:anchorId="767F7966" id="Straight Connector 2" o:spid="_x0000_s1026" style="position:absolute;z-index:251660288;visibility:visible;mso-wrap-style:square;mso-width-percent:0;mso-wrap-distance-left:9pt;mso-wrap-distance-top:0;mso-wrap-distance-right:9pt;mso-wrap-distance-bottom:0;mso-position-horizontal:absolute;mso-position-horizontal-relative:margin;mso-position-vertical:absolute;mso-position-vertical-relative:text;mso-width-percent:0;mso-width-relative:margin" from="56.85pt,15.3pt" to="190.75pt,15.3pt" o:gfxdata="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" strokecolor="black [3040]" strokeweight=".5pt">
                       <w10:wrap anchorx="margin"/>
                     </v:line>
                   </w:pict>
@@ -725,40 +725,19 @@
               <w:rPr>
                 <w:rFonts w:ascii="Times New Roman" w:hAnsi="Times New Roman"/>
               </w:rPr>
-              <w:t>- PGĐ Trần Tiến Nam (để c/đ);</w:t>
+              <w:t xml:space="preserve">- </w:t>
             </w:r>
-          </w:p>
-          <w:p>
-            <w:pPr>
-              <w:spacing w:after="40"/>
-            </w:pPr>
             <w:r>
               <w:rPr>
                 <w:rFonts w:ascii="Times New Roman" w:hAnsi="Times New Roman"/>
               </w:rPr>
-              <w:t>- Phòng KT-AT (để p/h);</w:t>
+              <w:t>Ban Giám đốc</w:t>
             </w:r>
-          </w:p>
-          <w:p>
-            <w:pPr>
-              <w:spacing w:after="40"/>
-            </w:pPr>
             <w:r>
               <w:rPr>
                 <w:rFonts w:ascii="Times New Roman" w:hAnsi="Times New Roman"/>
               </w:rPr>
-              <w:t>- Phòng TCKT (01b);</w:t>
-            </w:r>
-          </w:p>
-          <w:p>
-            <w:pPr>
-              <w:spacing w:after="40"/>
-            </w:pPr>
-            <w:r>
-              <w:rPr>
-                <w:rFonts w:ascii="Times New Roman" w:hAnsi="Times New Roman"/>
-              </w:rPr>
-              <w:t>- {ten_xi_nghiep} (để t/h);</w:t>
+              <w:t xml:space="preserve"> (để c/đ);</w:t>
             </w:r>
           </w:p>
           <w:p>

</xml_diff>